<commit_message>
docs: update report generator with detailed subheadings for all guidelines items
</commit_message>
<xml_diff>
--- a/docs/project_report.docx
+++ b/docs/project_report.docx
@@ -2932,7 +2932,7 @@
           <w:color w:val="000000"/>
           <w:sz w:val="28"/>
         </w:rPr>
-        <w:t>1.2 PURPOSE AND OBJECTIVES</w:t>
+        <w:t>1.2 PURPOSE: GOALS &amp; OBJECTIVES</w:t>
       </w:r>
     </w:p>
     <w:p>
@@ -2948,7 +2948,7 @@
           <w:color w:val="000000"/>
           <w:sz w:val="24"/>
         </w:rPr>
-        <w:t>The primary purpose of this project is to bridge deep learning research with clinical utility by creating an accessible, accurate, and explainable web diagnostic interface. The core objectives include:</w:t>
+        <w:t>The primary purpose of this project is to bridge deep learning research with clinical utility by creating an accessible, accurate, and explainable web diagnostic interface. The core goals and objectives include:</w:t>
       </w:r>
     </w:p>
     <w:p>
@@ -3029,7 +3029,7 @@
           <w:color w:val="000000"/>
           <w:sz w:val="28"/>
         </w:rPr>
-        <w:t>1.3 PROJECT SCOPE AND LIMITATIONS</w:t>
+        <w:t>1.3 SCOPE</w:t>
       </w:r>
     </w:p>
     <w:p>
@@ -3061,7 +3061,7 @@
           <w:color w:val="000000"/>
           <w:sz w:val="24"/>
         </w:rPr>
-        <w:t>• Binary Classification Scope: The model discriminates between 'Tumor' and 'No Tumor' categories.</w:t>
+        <w:t>• What the system CAN do: Classify axial brain MRI images into 'Tumor' vs 'No Tumor', provide classification confidence percentages, generate Grad-CAM visual heatmaps, and display benchmark dataset statistics.</w:t>
       </w:r>
     </w:p>
     <w:p>
@@ -3077,7 +3077,7 @@
           <w:color w:val="000000"/>
           <w:sz w:val="24"/>
         </w:rPr>
-        <w:t>• Non-Clinical Scope: Designed for educational, academic, and decision-support research, not autonomous surgical decisions.</w:t>
+        <w:t>• What the system CANNOT do: Provide multi-class subtyping (e.g. distinguishing glioma vs meningioma), process 3D DICOM volumes directly without 2D slice extraction, or replace professional radiological diagnosis without clinical trial validation.</w:t>
       </w:r>
     </w:p>
     <w:p>
@@ -3094,7 +3094,7 @@
           <w:color w:val="000000"/>
           <w:sz w:val="28"/>
         </w:rPr>
-        <w:t>1.4 LITERATURE REVIEW</w:t>
+        <w:t>1.4 TECHNOLOGY AND LITERATURE REVIEW</w:t>
       </w:r>
     </w:p>
     <w:p>
@@ -3110,7 +3110,7 @@
           <w:color w:val="000000"/>
           <w:sz w:val="24"/>
         </w:rPr>
-        <w:t>Recent advancements in deep convolutional networks have revolutionized computer-vision-based medical imaging. Traditional machine learning techniques relied heavily on hand-crafted features such as Haar wavelets, texture descriptors (GLCM), and support vector machines (SVM). In contrast, end-to-end CNNs automatically extract hierarchical spatial representations ranging from low-level edge features to complex anatomical boundaries.</w:t>
+        <w:t>Recent advancements in deep convolutional networks have revolutionized computer-vision-based medical imaging. Traditional machine learning techniques relied heavily on hand-crafted features such as Haar wavelets, texture descriptors (GLCM), and support vector machines (SVM). In contrast, end-to-end CNNs automatically extract hierarchical spatial representations ranging from low-level edge features to complex anatomical boundaries. Recent research by Selvaraju et al. (2017) demonstrated that Gradient-weighted Class Activation Mapping (Grad-CAM) provides fine-grained visual explainability for CNN decisions, making deep learning models trustworthy for clinical decision support.</w:t>
       </w:r>
     </w:p>
     <w:p>
@@ -3149,7 +3149,24 @@
           <w:color w:val="000000"/>
           <w:sz w:val="28"/>
         </w:rPr>
-        <w:t>2.1 DEVELOPMENT APPROACH</w:t>
+        <w:t>2.1 PROJECT PLANNING AND SCHEDULING</w:t>
+      </w:r>
+    </w:p>
+    <w:p>
+      <w:pPr>
+        <w:keepNext/>
+        <w:spacing w:before="240" w:after="120"/>
+        <w:jc w:val="left"/>
+      </w:pPr>
+      <w:r>
+        <w:rPr>
+          <w:rFonts w:ascii="Times New Roman" w:hAnsi="Times New Roman"/>
+          <w:b/>
+          <w:i w:val="0"/>
+          <w:color w:val="000000"/>
+          <w:sz w:val="24"/>
+        </w:rPr>
+        <w:t>2.1.1 Project Development Approach And Justification</w:t>
       </w:r>
     </w:p>
     <w:p>
@@ -3180,9 +3197,9 @@
           <w:b/>
           <w:i w:val="0"/>
           <w:color w:val="000000"/>
-          <w:sz w:val="28"/>
+          <w:sz w:val="24"/>
         </w:rPr>
-        <w:t>2.2 PROJECT SCHEDULE AND MILESTONES</w:t>
+        <w:t>2.1.2 Project Plan Including Milestones, Deliverables, Roles And Dependencies</w:t>
       </w:r>
     </w:p>
     <w:p>
@@ -3282,7 +3299,7 @@
                 <w:color w:val="FFFFFF"/>
                 <w:sz w:val="20"/>
               </w:rPr>
-              <w:t>Deliverables</w:t>
+              <w:t>Deliverables &amp; Dependencies</w:t>
             </w:r>
           </w:p>
         </w:tc>
@@ -3658,7 +3675,7 @@
                 <w:color w:val="000000"/>
                 <w:sz w:val="20"/>
               </w:rPr>
-              <w:t>app.py, model_utils.py, HTML/CSS UI</w:t>
+              <w:t>app.py, model_utils.py, HTML/CSS UI, start.py</w:t>
             </w:r>
           </w:p>
         </w:tc>
@@ -3786,9 +3803,9 @@
           <w:b/>
           <w:i w:val="0"/>
           <w:color w:val="000000"/>
-          <w:sz w:val="28"/>
+          <w:sz w:val="24"/>
         </w:rPr>
-        <w:t>2.3 RISK IDENTIFICATION AND MITIGATION PLAN</w:t>
+        <w:t>2.1.3 Schedule Representation</w:t>
       </w:r>
     </w:p>
     <w:p>
@@ -3804,7 +3821,123 @@
           <w:color w:val="000000"/>
           <w:sz w:val="24"/>
         </w:rPr>
-        <w:t>Risk management specifically addressed dataset imbalance, model overfitting, missed tumor predictions (false negatives), and web upload vulnerabilities:</w:t>
+        <w:t>The project schedule was managed using a Gantt timeline representation spanning 16 weeks. Data preparation occupied Weeks 1-3, Model Architecture &amp; Training spanned Weeks 4-7, Recall Tuning &amp; Metric Validation spanned Weeks 8-10, Flask &amp; Grad-CAM Web App Integration spanned Weeks 11-14, and Verification, Report Generation, and Deployment Documentation completed in Weeks 15-16.</w:t>
+      </w:r>
+    </w:p>
+    <w:p>
+      <w:pPr>
+        <w:keepNext/>
+        <w:spacing w:before="240" w:after="120"/>
+        <w:jc w:val="left"/>
+      </w:pPr>
+      <w:r>
+        <w:rPr>
+          <w:rFonts w:ascii="Times New Roman" w:hAnsi="Times New Roman"/>
+          <w:b/>
+          <w:i w:val="0"/>
+          <w:color w:val="000000"/>
+          <w:sz w:val="28"/>
+        </w:rPr>
+        <w:t>2.2 RISK MANAGEMENT</w:t>
+      </w:r>
+    </w:p>
+    <w:p>
+      <w:pPr>
+        <w:keepNext/>
+        <w:spacing w:before="240" w:after="120"/>
+        <w:jc w:val="left"/>
+      </w:pPr>
+      <w:r>
+        <w:rPr>
+          <w:rFonts w:ascii="Times New Roman" w:hAnsi="Times New Roman"/>
+          <w:b/>
+          <w:i w:val="0"/>
+          <w:color w:val="000000"/>
+          <w:sz w:val="24"/>
+        </w:rPr>
+        <w:t>2.2.1 Risk Identification</w:t>
+      </w:r>
+    </w:p>
+    <w:p>
+      <w:pPr>
+        <w:spacing w:line="360" w:lineRule="auto" w:after="120"/>
+        <w:jc w:val="both"/>
+      </w:pPr>
+      <w:r>
+        <w:rPr>
+          <w:rFonts w:ascii="Times New Roman" w:hAnsi="Times New Roman"/>
+          <w:b w:val="0"/>
+          <w:i w:val="0"/>
+          <w:color w:val="000000"/>
+          <w:sz w:val="24"/>
+        </w:rPr>
+        <w:t>Risk identification focused on discovering potential technical, medical, and operational risks specific to this deep learning medical diagnostic application. Four primary risks were identified: (1) False negative diagnosis (missed tumor cases), (2) Overfitting to training MRI scans, (3) Corrupted or malicious web file uploads, and (4) Grad-CAM feature map layer extraction failures.</w:t>
+      </w:r>
+    </w:p>
+    <w:p>
+      <w:pPr>
+        <w:keepNext/>
+        <w:spacing w:before="240" w:after="120"/>
+        <w:jc w:val="left"/>
+      </w:pPr>
+      <w:r>
+        <w:rPr>
+          <w:rFonts w:ascii="Times New Roman" w:hAnsi="Times New Roman"/>
+          <w:b/>
+          <w:i w:val="0"/>
+          <w:color w:val="000000"/>
+          <w:sz w:val="24"/>
+        </w:rPr>
+        <w:t>2.2.2 Risk Analysis</w:t>
+      </w:r>
+    </w:p>
+    <w:p>
+      <w:pPr>
+        <w:spacing w:line="360" w:lineRule="auto" w:after="120"/>
+        <w:jc w:val="both"/>
+      </w:pPr>
+      <w:r>
+        <w:rPr>
+          <w:rFonts w:ascii="Times New Roman" w:hAnsi="Times New Roman"/>
+          <w:b w:val="0"/>
+          <w:i w:val="0"/>
+          <w:color w:val="000000"/>
+          <w:sz w:val="24"/>
+        </w:rPr>
+        <w:t>Risk analysis evaluated the probability and severity of each identified risk. False negative classification carried CRITICAL severity because missing a malignant brain tumor in screening has severe life-threatening consequences. Overfitting carried HIGH impact as it impairs generalization on unseen patient scans. Malicious file uploads carried MEDIUM impact on server stability, while Grad-CAM layer mismatch carried LOW impact on prediction output.</w:t>
+      </w:r>
+    </w:p>
+    <w:p>
+      <w:pPr>
+        <w:keepNext/>
+        <w:spacing w:before="240" w:after="120"/>
+        <w:jc w:val="left"/>
+      </w:pPr>
+      <w:r>
+        <w:rPr>
+          <w:rFonts w:ascii="Times New Roman" w:hAnsi="Times New Roman"/>
+          <w:b/>
+          <w:i w:val="0"/>
+          <w:color w:val="000000"/>
+          <w:sz w:val="24"/>
+        </w:rPr>
+        <w:t>2.2.3 Risk Planning</w:t>
+      </w:r>
+    </w:p>
+    <w:p>
+      <w:pPr>
+        <w:spacing w:line="360" w:lineRule="auto" w:after="120"/>
+        <w:jc w:val="both"/>
+      </w:pPr>
+      <w:r>
+        <w:rPr>
+          <w:rFonts w:ascii="Times New Roman" w:hAnsi="Times New Roman"/>
+          <w:b w:val="0"/>
+          <w:i w:val="0"/>
+          <w:color w:val="000000"/>
+          <w:sz w:val="24"/>
+        </w:rPr>
+        <w:t>Risk planning formulated concrete strategies implemented directly in the code to manage each risk, as detailed in Table 2.2:</w:t>
       </w:r>
     </w:p>
     <w:tbl>
@@ -4227,7 +4360,7 @@
           <w:color w:val="000000"/>
           <w:sz w:val="24"/>
         </w:rPr>
-        <w:t>The system is designed for medical researchers, computer science students, and biomedical developers. Users are expected to have basic familiarity with web interfaces and digital brain MRI scan file formats (PNG, JPG).</w:t>
+        <w:t>The system is designed for medical researchers, computer science students, and biomedical developers. Users are expected to have basic familiarity with web interfaces and digital brain MRI scan file formats (PNG, JPG, JPEG).</w:t>
       </w:r>
     </w:p>
     <w:p>
@@ -4845,6 +4978,47 @@
       </w:r>
     </w:p>
     <w:p>
+      <w:pPr>
+        <w:keepNext/>
+        <w:spacing w:before="240" w:after="120"/>
+        <w:jc w:val="left"/>
+      </w:pPr>
+      <w:r>
+        <w:rPr>
+          <w:rFonts w:ascii="Times New Roman" w:hAnsi="Times New Roman"/>
+          <w:b/>
+          <w:i w:val="0"/>
+          <w:color w:val="000000"/>
+          <w:sz w:val="28"/>
+        </w:rPr>
+        <w:t>3.3 CONSTRAINTS</w:t>
+      </w:r>
+    </w:p>
+    <w:p>
+      <w:pPr>
+        <w:spacing w:line="360" w:lineRule="auto" w:after="120"/>
+        <w:jc w:val="both"/>
+      </w:pPr>
+      <w:r>
+        <w:rPr>
+          <w:rFonts w:ascii="Times New Roman" w:hAnsi="Times New Roman"/>
+          <w:b w:val="0"/>
+          <w:i w:val="0"/>
+          <w:color w:val="000000"/>
+          <w:sz w:val="24"/>
+        </w:rPr>
+        <w:t>System implementation and operation are subject to several technical and regulatory constraints:</w:t>
+        <w:br/>
+        <w:t>• Regulatory &amp; Clinical Constraints: The system is developed exclusively for educational and decision-support research. It is not approved by regulatory medical bodies (e.g. FDA/CE) for autonomous diagnostic use.</w:t>
+        <w:br/>
+        <w:t>• Hardware Limitations: Inference runs efficiently on standard CPUs without requiring high-end dedicated GPUs.</w:t>
+        <w:br/>
+        <w:t>• File Size &amp; Format Constraints: Uploads are constrained to PNG, JPG, and JPEG formats under 10MB per request.</w:t>
+        <w:br/>
+        <w:t>• Security &amp; Reliability Constraints: Strict input validation prevents arbitrary file execution, and exception boundaries ensure the web server returns clean HTTP 400/500 responses without exposing internal stack traces.</w:t>
+      </w:r>
+    </w:p>
+    <w:p>
       <w:r>
         <w:br w:type="page"/>
       </w:r>
@@ -4880,7 +5054,7 @@
           <w:color w:val="000000"/>
           <w:sz w:val="28"/>
         </w:rPr>
-        <w:t>4.1 ANALYSIS OF EXISTING SYSTEM</w:t>
+        <w:t>4.1 STUDY OF CURRENT SYSTEM</w:t>
       </w:r>
     </w:p>
     <w:p>
@@ -4896,7 +5070,7 @@
           <w:color w:val="000000"/>
           <w:sz w:val="24"/>
         </w:rPr>
-        <w:t>Existing diagnosis relies on qualitative radiologist visual inspection. Key flaws include: (1) High diagnostic latency during emergency triaging, (2) Subjective boundary interpretation leading to missed low-contrast tumors, and (3) Lack of automated explainability visualization.</w:t>
+        <w:t>The current diagnostic system relies on manual qualitative evaluation of brain MRI slices by neuroradiologists. Radiologists inspect T1-weighted, T2-weighted, and FLAIR MRI sequences to identify abnormal tissue contrast, edema, and mass effect.</w:t>
       </w:r>
     </w:p>
     <w:p>
@@ -4913,7 +5087,7 @@
           <w:color w:val="000000"/>
           <w:sz w:val="28"/>
         </w:rPr>
-        <w:t>4.2 PROPOSED AUTOMATED CNN SYSTEM</w:t>
+        <w:t>4.2 PROBLEM AND WEAKNESSES OF CURRENT SYSTEM</w:t>
       </w:r>
     </w:p>
     <w:p>
@@ -4929,7 +5103,7 @@
           <w:color w:val="000000"/>
           <w:sz w:val="24"/>
         </w:rPr>
-        <w:t>The proposed system integrates automated image resizing (224x224x3), 1/255 rescaling, CNN feature extraction, and Grad-CAM visual heatmaps inside a Flask application, achieving immediate objective feedback.</w:t>
+        <w:t>Key weaknesses of manual evaluation include: (1) High diagnostic latency during emergency triaging, (2) Subjective boundary interpretation leading to missed low-contrast or early-stage tumors, (3) High cognitive workload causing diagnostic fatigue, and (4) Lack of automated quantitative explainability.</w:t>
       </w:r>
     </w:p>
     <w:p>
@@ -4946,7 +5120,7 @@
           <w:color w:val="000000"/>
           <w:sz w:val="28"/>
         </w:rPr>
-        <w:t>4.3 DATASET MODELING &amp; DISTRIBUTION</w:t>
+        <w:t>4.3 REQUIREMENTS OF PROPOSED SYSTEM</w:t>
       </w:r>
     </w:p>
     <w:p>
@@ -4962,7 +5136,454 @@
           <w:color w:val="000000"/>
           <w:sz w:val="24"/>
         </w:rPr>
-        <w:t>The dataset contains brain MRI slices organized into Training, Validation, and Testing sets as detailed in Table 4.1:</w:t>
+        <w:t>The proposed system addresses these limitations through automated deep learning inference:</w:t>
+        <w:br/>
+        <w:t>• Functional Requirements: Upload axial brain MRI scans via browser, perform 224x224 RGB image preprocessing, classify scans into 'Tumor' or 'No Tumor' with confidence percentage, generate Grad-CAM visual heatmaps highlighting tumor regions, and display historical benchmark model performance metrics.</w:t>
+        <w:br/>
+        <w:t>• Non-Functional Requirements: Sub-second inference time (&lt;500ms), 100% tumor recall safety target, robust HTTP 400/500 error views, intuitive responsive dark UI usable on desktop and mobile, and full compliance with PEP8 code modularity.</w:t>
+      </w:r>
+    </w:p>
+    <w:p>
+      <w:pPr>
+        <w:keepNext/>
+        <w:spacing w:before="240" w:after="120"/>
+        <w:jc w:val="left"/>
+      </w:pPr>
+      <w:r>
+        <w:rPr>
+          <w:rFonts w:ascii="Times New Roman" w:hAnsi="Times New Roman"/>
+          <w:b/>
+          <w:i w:val="0"/>
+          <w:color w:val="000000"/>
+          <w:sz w:val="28"/>
+        </w:rPr>
+        <w:t>4.4 FEASIBILITY STUDY</w:t>
+      </w:r>
+    </w:p>
+    <w:p>
+      <w:pPr>
+        <w:spacing w:line="360" w:lineRule="auto" w:after="120"/>
+        <w:jc w:val="both"/>
+      </w:pPr>
+      <w:r>
+        <w:rPr>
+          <w:rFonts w:ascii="Times New Roman" w:hAnsi="Times New Roman"/>
+          <w:b w:val="0"/>
+          <w:i w:val="0"/>
+          <w:color w:val="000000"/>
+          <w:sz w:val="24"/>
+        </w:rPr>
+        <w:t>Feasibility analysis was performed across three dimensions:</w:t>
+        <w:br/>
+        <w:t>• Technical Feasibility: High. TensorFlow/Keras and OpenCV provide mature, robust APIs for deep learning inference and Grad-CAM visualization on standard hardware.</w:t>
+        <w:br/>
+        <w:t>• Operational Feasibility: High. The single-page drag-and-drop web UI requires zero technical training for medical researchers or healthcare students.</w:t>
+        <w:br/>
+        <w:t>• Economic Feasibility: High. Built entirely using open-source Python software stack (Flask, Keras, OpenCV, NumPy) without licensing costs.</w:t>
+      </w:r>
+    </w:p>
+    <w:p>
+      <w:pPr>
+        <w:keepNext/>
+        <w:spacing w:before="240" w:after="120"/>
+        <w:jc w:val="left"/>
+      </w:pPr>
+      <w:r>
+        <w:rPr>
+          <w:rFonts w:ascii="Times New Roman" w:hAnsi="Times New Roman"/>
+          <w:b/>
+          <w:i w:val="0"/>
+          <w:color w:val="000000"/>
+          <w:sz w:val="28"/>
+        </w:rPr>
+        <w:t>4.5 REQUIREMENTS VALIDATION</w:t>
+      </w:r>
+    </w:p>
+    <w:p>
+      <w:pPr>
+        <w:spacing w:line="360" w:lineRule="auto" w:after="120"/>
+        <w:jc w:val="both"/>
+      </w:pPr>
+      <w:r>
+        <w:rPr>
+          <w:rFonts w:ascii="Times New Roman" w:hAnsi="Times New Roman"/>
+          <w:b w:val="0"/>
+          <w:i w:val="0"/>
+          <w:color w:val="000000"/>
+          <w:sz w:val="24"/>
+        </w:rPr>
+        <w:t>Requirements were validated through empirical testing on a benchmark dataset of 666 MRI test scans, demonstrating 98% accuracy and zero false negatives (100% recall).</w:t>
+      </w:r>
+    </w:p>
+    <w:p>
+      <w:pPr>
+        <w:keepNext/>
+        <w:spacing w:before="240" w:after="120"/>
+        <w:jc w:val="left"/>
+      </w:pPr>
+      <w:r>
+        <w:rPr>
+          <w:rFonts w:ascii="Times New Roman" w:hAnsi="Times New Roman"/>
+          <w:b/>
+          <w:i w:val="0"/>
+          <w:color w:val="000000"/>
+          <w:sz w:val="28"/>
+        </w:rPr>
+        <w:t>4.6 FUNCTIONS OF SYSTEM</w:t>
+      </w:r>
+    </w:p>
+    <w:p>
+      <w:pPr>
+        <w:keepNext/>
+        <w:spacing w:before="240" w:after="120"/>
+        <w:jc w:val="left"/>
+      </w:pPr>
+      <w:r>
+        <w:rPr>
+          <w:rFonts w:ascii="Times New Roman" w:hAnsi="Times New Roman"/>
+          <w:b/>
+          <w:i w:val="0"/>
+          <w:color w:val="000000"/>
+          <w:sz w:val="24"/>
+        </w:rPr>
+        <w:t>4.6.1 Use Cases And System Scenarios</w:t>
+      </w:r>
+    </w:p>
+    <w:p>
+      <w:pPr>
+        <w:spacing w:line="360" w:lineRule="auto" w:after="120"/>
+        <w:jc w:val="both"/>
+      </w:pPr>
+      <w:r>
+        <w:rPr>
+          <w:rFonts w:ascii="Times New Roman" w:hAnsi="Times New Roman"/>
+          <w:b w:val="0"/>
+          <w:i w:val="0"/>
+          <w:color w:val="000000"/>
+          <w:sz w:val="24"/>
+        </w:rPr>
+        <w:t>Primary Use Case Scenario:</w:t>
+        <w:br/>
+        <w:t>1. User accesses web homepage at http://127.0.0.1:5000.</w:t>
+        <w:br/>
+        <w:t>2. User selects or drops a brain MRI image file (PNG/JPG).</w:t>
+        <w:br/>
+        <w:t>3. System validates file extension and size.</w:t>
+        <w:br/>
+        <w:t>4. Server executes preprocessing, CNN prediction, and Grad-CAM heatmap generation.</w:t>
+        <w:br/>
+        <w:t>5. System renders results page displaying color-coded prediction badge, confidence bar, and side-by-side original and heatmap images.</w:t>
+      </w:r>
+    </w:p>
+    <w:p>
+      <w:pPr>
+        <w:keepNext/>
+        <w:spacing w:before="240" w:after="120"/>
+        <w:jc w:val="left"/>
+      </w:pPr>
+      <w:r>
+        <w:rPr>
+          <w:rFonts w:ascii="Times New Roman" w:hAnsi="Times New Roman"/>
+          <w:b/>
+          <w:i w:val="0"/>
+          <w:color w:val="000000"/>
+          <w:sz w:val="28"/>
+        </w:rPr>
+        <w:t>4.7 DATA MODELING</w:t>
+      </w:r>
+    </w:p>
+    <w:p>
+      <w:pPr>
+        <w:keepNext/>
+        <w:spacing w:before="240" w:after="120"/>
+        <w:jc w:val="left"/>
+      </w:pPr>
+      <w:r>
+        <w:rPr>
+          <w:rFonts w:ascii="Times New Roman" w:hAnsi="Times New Roman"/>
+          <w:b/>
+          <w:i w:val="0"/>
+          <w:color w:val="000000"/>
+          <w:sz w:val="24"/>
+        </w:rPr>
+        <w:t>4.7.1 Data Dictionary</w:t>
+      </w:r>
+    </w:p>
+    <w:p>
+      <w:pPr>
+        <w:spacing w:line="360" w:lineRule="auto" w:after="120"/>
+        <w:jc w:val="both"/>
+      </w:pPr>
+      <w:r>
+        <w:rPr>
+          <w:rFonts w:ascii="Times New Roman" w:hAnsi="Times New Roman"/>
+          <w:b w:val="0"/>
+          <w:i w:val="0"/>
+          <w:color w:val="000000"/>
+          <w:sz w:val="24"/>
+        </w:rPr>
+        <w:t>Data Elements in Image Processing Pipeline:</w:t>
+        <w:br/>
+        <w:t>• raw_image_file: Binary image stream uploaded by user (PNG/JPG, max 10MB).</w:t>
+        <w:br/>
+        <w:t>• processed_tensor: NumPy float32 array of shape (1, 224, 224, 3) with normalized values [0, 1].</w:t>
+        <w:br/>
+        <w:t>• prediction_sigmoid: Floating-point value in range [0.0, 1.0] representing tumor probability.</w:t>
+        <w:br/>
+        <w:t>• prediction_label: String ('Tumor' if prob &gt;= 0.3 else 'No Tumor').</w:t>
+        <w:br/>
+        <w:t>• confidence_percentage: Round float percentage (0.0% to 100.0%).</w:t>
+        <w:br/>
+        <w:t>• heatmap_overlay: RGB image array of shape (H, W, 3) combining scan and JET colormap.</w:t>
+      </w:r>
+    </w:p>
+    <w:p>
+      <w:pPr>
+        <w:keepNext/>
+        <w:spacing w:before="240" w:after="120"/>
+        <w:jc w:val="left"/>
+      </w:pPr>
+      <w:r>
+        <w:rPr>
+          <w:rFonts w:ascii="Times New Roman" w:hAnsi="Times New Roman"/>
+          <w:b/>
+          <w:i w:val="0"/>
+          <w:color w:val="000000"/>
+          <w:sz w:val="24"/>
+        </w:rPr>
+        <w:t>4.7.3 Class Diagram</w:t>
+      </w:r>
+    </w:p>
+    <w:p>
+      <w:pPr>
+        <w:spacing w:line="360" w:lineRule="auto" w:after="120"/>
+        <w:jc w:val="both"/>
+      </w:pPr>
+      <w:r>
+        <w:rPr>
+          <w:rFonts w:ascii="Times New Roman" w:hAnsi="Times New Roman"/>
+          <w:b w:val="0"/>
+          <w:i w:val="0"/>
+          <w:color w:val="000000"/>
+          <w:sz w:val="24"/>
+        </w:rPr>
+        <w:t>System Classes &amp; Services:</w:t>
+        <w:br/>
+        <w:t>• Config: Holds application constants (IMG_SIZE, MODEL_PATH, CLASSIFICATION_THRESHOLD).</w:t>
+        <w:br/>
+        <w:t>• ModelService: Singleton loader and prediction executor.</w:t>
+        <w:br/>
+        <w:t>• ImageService: Preprocessing, resizing, and normalization.</w:t>
+        <w:br/>
+        <w:t>• GradCAMService: Gradient extraction and heatmap color blending.</w:t>
+        <w:br/>
+        <w:t>• ValidationService: Extension and size checking.</w:t>
+      </w:r>
+    </w:p>
+    <w:p>
+      <w:pPr>
+        <w:keepNext/>
+        <w:spacing w:before="240" w:after="120"/>
+        <w:jc w:val="left"/>
+      </w:pPr>
+      <w:r>
+        <w:rPr>
+          <w:rFonts w:ascii="Times New Roman" w:hAnsi="Times New Roman"/>
+          <w:b/>
+          <w:i w:val="0"/>
+          <w:color w:val="000000"/>
+          <w:sz w:val="24"/>
+        </w:rPr>
+        <w:t>4.7.4 System Activity</w:t>
+      </w:r>
+    </w:p>
+    <w:p>
+      <w:pPr>
+        <w:spacing w:line="360" w:lineRule="auto" w:after="120"/>
+        <w:jc w:val="both"/>
+      </w:pPr>
+      <w:r>
+        <w:rPr>
+          <w:rFonts w:ascii="Times New Roman" w:hAnsi="Times New Roman"/>
+          <w:b w:val="0"/>
+          <w:i w:val="0"/>
+          <w:color w:val="000000"/>
+          <w:sz w:val="24"/>
+        </w:rPr>
+        <w:t>System Activity Flow: User Upload → Validation Guard → Preprocessor → Model Inference → Grad-CAM Engine → HTML Template Renderer → Client Display.</w:t>
+      </w:r>
+    </w:p>
+    <w:p>
+      <w:pPr>
+        <w:keepNext/>
+        <w:spacing w:before="240" w:after="120"/>
+        <w:jc w:val="left"/>
+      </w:pPr>
+      <w:r>
+        <w:rPr>
+          <w:rFonts w:ascii="Times New Roman" w:hAnsi="Times New Roman"/>
+          <w:b/>
+          <w:i w:val="0"/>
+          <w:color w:val="000000"/>
+          <w:sz w:val="28"/>
+        </w:rPr>
+        <w:t>4.8 FUNCTIONAL AND BEHAVIORAL MODELING</w:t>
+      </w:r>
+    </w:p>
+    <w:p>
+      <w:pPr>
+        <w:keepNext/>
+        <w:spacing w:before="240" w:after="120"/>
+        <w:jc w:val="left"/>
+      </w:pPr>
+      <w:r>
+        <w:rPr>
+          <w:rFonts w:ascii="Times New Roman" w:hAnsi="Times New Roman"/>
+          <w:b/>
+          <w:i w:val="0"/>
+          <w:color w:val="000000"/>
+          <w:sz w:val="24"/>
+        </w:rPr>
+        <w:t>4.8.1 Data Flow Diagram (Dfd Level 0 &amp; Level 1)</w:t>
+      </w:r>
+    </w:p>
+    <w:p>
+      <w:pPr>
+        <w:spacing w:line="360" w:lineRule="auto" w:after="120"/>
+        <w:jc w:val="both"/>
+      </w:pPr>
+      <w:r>
+        <w:rPr>
+          <w:rFonts w:ascii="Times New Roman" w:hAnsi="Times New Roman"/>
+          <w:b w:val="0"/>
+          <w:i w:val="0"/>
+          <w:color w:val="000000"/>
+          <w:sz w:val="24"/>
+        </w:rPr>
+        <w:t>DFD Level 0 (Context Diagram): User uploads MRI file to Flask Application System, which returns Classification Label, Confidence Percentage, and Grad-CAM Heatmap Image.</w:t>
+        <w:br/>
+        <w:t>DFD Level 1: (1.0 File Validation) → (2.0 Image Preprocessing) → (3.0 Keras Model Inference) → (4.0 Grad-CAM Heatmap Overlay Generation) → (5.0 Result Template Rendering).</w:t>
+      </w:r>
+    </w:p>
+    <w:p>
+      <w:pPr>
+        <w:keepNext/>
+        <w:spacing w:before="240" w:after="120"/>
+        <w:jc w:val="left"/>
+      </w:pPr>
+      <w:r>
+        <w:rPr>
+          <w:rFonts w:ascii="Times New Roman" w:hAnsi="Times New Roman"/>
+          <w:b/>
+          <w:i w:val="0"/>
+          <w:color w:val="000000"/>
+          <w:sz w:val="24"/>
+        </w:rPr>
+        <w:t>4.8.2 Process Specification And Decision Logic</w:t>
+      </w:r>
+    </w:p>
+    <w:p>
+      <w:pPr>
+        <w:spacing w:line="360" w:lineRule="auto" w:after="120"/>
+        <w:jc w:val="both"/>
+      </w:pPr>
+      <w:r>
+        <w:rPr>
+          <w:rFonts w:ascii="Times New Roman" w:hAnsi="Times New Roman"/>
+          <w:b w:val="0"/>
+          <w:i w:val="0"/>
+          <w:color w:val="000000"/>
+          <w:sz w:val="24"/>
+        </w:rPr>
+        <w:t>Decision Logic for Classification:</w:t>
+        <w:br/>
+        <w:t>IF prediction_probability &gt;= 0.3 THEN label = 'Tumor', confidence = probability * 100</w:t>
+        <w:br/>
+        <w:t>ELSE label = 'No Tumor', confidence = (1 - probability) * 100</w:t>
+      </w:r>
+    </w:p>
+    <w:p>
+      <w:pPr>
+        <w:keepNext/>
+        <w:spacing w:before="240" w:after="120"/>
+        <w:jc w:val="left"/>
+      </w:pPr>
+      <w:r>
+        <w:rPr>
+          <w:rFonts w:ascii="Times New Roman" w:hAnsi="Times New Roman"/>
+          <w:b/>
+          <w:i w:val="0"/>
+          <w:color w:val="000000"/>
+          <w:sz w:val="28"/>
+        </w:rPr>
+        <w:t>4.9 MAIN MODULES OF NEW SYSTEM</w:t>
+      </w:r>
+    </w:p>
+    <w:p>
+      <w:pPr>
+        <w:spacing w:line="360" w:lineRule="auto" w:after="120"/>
+        <w:jc w:val="both"/>
+      </w:pPr>
+      <w:r>
+        <w:rPr>
+          <w:rFonts w:ascii="Times New Roman" w:hAnsi="Times New Roman"/>
+          <w:b w:val="0"/>
+          <w:i w:val="0"/>
+          <w:color w:val="000000"/>
+          <w:sz w:val="24"/>
+        </w:rPr>
+        <w:t>Main Modular Components:</w:t>
+        <w:br/>
+        <w:t>1. Web Router Module (app/routes/): Manages HTTP routes (/ predict, /stats, /health).</w:t>
+        <w:br/>
+        <w:t>2. Model Inference Service (app/services/model_service.py): Manages Keras singleton model.</w:t>
+        <w:br/>
+        <w:t>3. Preprocessing Service (app/services/image_service.py): Prepares 224x224 RGB tensors.</w:t>
+        <w:br/>
+        <w:t>4. Explainability Service (app/services/gradcam_service.py): Generates JET colormap overlays.</w:t>
+        <w:br/>
+        <w:t>5. One-Click Launcher (start.py): Initializes server and opens browser.</w:t>
+      </w:r>
+    </w:p>
+    <w:p>
+      <w:pPr>
+        <w:keepNext/>
+        <w:spacing w:before="240" w:after="120"/>
+        <w:jc w:val="left"/>
+      </w:pPr>
+      <w:r>
+        <w:rPr>
+          <w:rFonts w:ascii="Times New Roman" w:hAnsi="Times New Roman"/>
+          <w:b/>
+          <w:i w:val="0"/>
+          <w:color w:val="000000"/>
+          <w:sz w:val="28"/>
+        </w:rPr>
+        <w:t>4.10 SELECTION OF HARDWARE AND SOFTWARE AND JUSTIFICATION</w:t>
+      </w:r>
+    </w:p>
+    <w:p>
+      <w:pPr>
+        <w:spacing w:line="360" w:lineRule="auto" w:after="120"/>
+        <w:jc w:val="both"/>
+      </w:pPr>
+      <w:r>
+        <w:rPr>
+          <w:rFonts w:ascii="Times New Roman" w:hAnsi="Times New Roman"/>
+          <w:b w:val="0"/>
+          <w:i w:val="0"/>
+          <w:color w:val="000000"/>
+          <w:sz w:val="24"/>
+        </w:rPr>
+        <w:t>Selection Justification:</w:t>
+        <w:br/>
+        <w:t>• Python 3.11: Chosen for seamless compatibility with TensorFlow 2.21 and OpenCV.</w:t>
+        <w:br/>
+        <w:t>• Flask: Selected over Django for lightweight overhead and rapid RESTful rendering.</w:t>
+        <w:br/>
+        <w:t>• TensorFlow/Keras: Selected for robust CNN layers and autograd GradientTape support.</w:t>
+        <w:br/>
+        <w:t>• OpenCV: Selected for high-performance colormap blending (COLORMAP_JET).</w:t>
       </w:r>
     </w:p>
     <w:tbl>
@@ -5480,7 +6101,226 @@
           <w:color w:val="000000"/>
           <w:sz w:val="28"/>
         </w:rPr>
-        <w:t>5.1 SYSTEM ARCHITECTURE</w:t>
+        <w:t>5.1 DATABASE DESIGN AND DATA STRUCTURE DESIGN</w:t>
+      </w:r>
+    </w:p>
+    <w:p>
+      <w:pPr>
+        <w:keepNext/>
+        <w:spacing w:before="240" w:after="120"/>
+        <w:jc w:val="left"/>
+      </w:pPr>
+      <w:r>
+        <w:rPr>
+          <w:rFonts w:ascii="Times New Roman" w:hAnsi="Times New Roman"/>
+          <w:b/>
+          <w:i w:val="0"/>
+          <w:color w:val="000000"/>
+          <w:sz w:val="24"/>
+        </w:rPr>
+        <w:t>5.1.1 Logical Description Of Data And Classes</w:t>
+      </w:r>
+    </w:p>
+    <w:p>
+      <w:pPr>
+        <w:spacing w:line="360" w:lineRule="auto" w:after="120"/>
+        <w:jc w:val="both"/>
+      </w:pPr>
+      <w:r>
+        <w:rPr>
+          <w:rFonts w:ascii="Times New Roman" w:hAnsi="Times New Roman"/>
+          <w:b w:val="0"/>
+          <w:i w:val="0"/>
+          <w:color w:val="000000"/>
+          <w:sz w:val="24"/>
+        </w:rPr>
+        <w:t>The system uses file-system data structures and NumPy tensors rather than relational databases:</w:t>
+        <w:br/>
+        <w:t>• Model File: bestModel.keras (HDF5/Keras 3 zip format containing weights, layer configs, optimizer state).</w:t>
+        <w:br/>
+        <w:t>• Runtime Storage: app/static/uploads/ (temporary uploaded images) and app/static/heatmaps/ (generated overlays).</w:t>
+        <w:br/>
+        <w:t>• Performance Cache: In-memory python metrics dictionary rendering on /stats route.</w:t>
+      </w:r>
+    </w:p>
+    <w:p>
+      <w:pPr>
+        <w:keepNext/>
+        <w:spacing w:before="240" w:after="120"/>
+        <w:jc w:val="left"/>
+      </w:pPr>
+      <w:r>
+        <w:rPr>
+          <w:rFonts w:ascii="Times New Roman" w:hAnsi="Times New Roman"/>
+          <w:b/>
+          <w:i w:val="0"/>
+          <w:color w:val="000000"/>
+          <w:sz w:val="28"/>
+        </w:rPr>
+        <w:t>5.2 SYSTEM PROCEDURAL DESIGN</w:t>
+      </w:r>
+    </w:p>
+    <w:p>
+      <w:pPr>
+        <w:keepNext/>
+        <w:spacing w:before="240" w:after="120"/>
+        <w:jc w:val="left"/>
+      </w:pPr>
+      <w:r>
+        <w:rPr>
+          <w:rFonts w:ascii="Times New Roman" w:hAnsi="Times New Roman"/>
+          <w:b/>
+          <w:i w:val="0"/>
+          <w:color w:val="000000"/>
+          <w:sz w:val="24"/>
+        </w:rPr>
+        <w:t>5.2.1 Procedural Logic Flowchart</w:t>
+      </w:r>
+    </w:p>
+    <w:p>
+      <w:pPr>
+        <w:spacing w:line="360" w:lineRule="auto" w:after="120"/>
+        <w:jc w:val="both"/>
+      </w:pPr>
+      <w:r>
+        <w:rPr>
+          <w:rFonts w:ascii="Times New Roman" w:hAnsi="Times New Roman"/>
+          <w:b w:val="0"/>
+          <w:i w:val="0"/>
+          <w:color w:val="000000"/>
+          <w:sz w:val="24"/>
+        </w:rPr>
+        <w:t>Procedural Logic:</w:t>
+        <w:br/>
+        <w:t>1. Receive POST request on /predict with file upload.</w:t>
+        <w:br/>
+        <w:t>2. Check if file extension is in {.png, .jpg, .jpeg}. If false, abort 400.</w:t>
+        <w:br/>
+        <w:t>3. Save file to app/static/uploads/ with unique prefix.</w:t>
+        <w:br/>
+        <w:t>4. Check file size &lt;= 10MB. If false, remove file and abort 400.</w:t>
+        <w:br/>
+        <w:t>5. Preprocess image to 224x224x3 float32 array / 255.0.</w:t>
+        <w:br/>
+        <w:t>6. Model predicts probability p. If p &gt;= 0.3, set label='Tumor', else 'No Tumor'.</w:t>
+        <w:br/>
+        <w:t>7. Execute Grad-CAM gradient tape pass on last Conv2D layer; overlay JET colormap.</w:t>
+        <w:br/>
+        <w:t>8. Render result.html template with prediction, confidence %, original image, and heatmap.</w:t>
+      </w:r>
+    </w:p>
+    <w:p>
+      <w:pPr>
+        <w:keepNext/>
+        <w:spacing w:before="240" w:after="120"/>
+        <w:jc w:val="left"/>
+      </w:pPr>
+      <w:r>
+        <w:rPr>
+          <w:rFonts w:ascii="Times New Roman" w:hAnsi="Times New Roman"/>
+          <w:b/>
+          <w:i w:val="0"/>
+          <w:color w:val="000000"/>
+          <w:sz w:val="28"/>
+        </w:rPr>
+        <w:t>5.3 INPUT/OUTPUT AND INTERFACE DESIGN</w:t>
+      </w:r>
+    </w:p>
+    <w:p>
+      <w:pPr>
+        <w:keepNext/>
+        <w:spacing w:before="240" w:after="120"/>
+        <w:jc w:val="left"/>
+      </w:pPr>
+      <w:r>
+        <w:rPr>
+          <w:rFonts w:ascii="Times New Roman" w:hAnsi="Times New Roman"/>
+          <w:b/>
+          <w:i w:val="0"/>
+          <w:color w:val="000000"/>
+          <w:sz w:val="24"/>
+        </w:rPr>
+        <w:t>5.3.1 Samples Of Forms And Interfaces</w:t>
+      </w:r>
+    </w:p>
+    <w:p>
+      <w:pPr>
+        <w:spacing w:line="360" w:lineRule="auto" w:after="120"/>
+        <w:jc w:val="both"/>
+      </w:pPr>
+      <w:r>
+        <w:rPr>
+          <w:rFonts w:ascii="Times New Roman" w:hAnsi="Times New Roman"/>
+          <w:b w:val="0"/>
+          <w:i w:val="0"/>
+          <w:color w:val="000000"/>
+          <w:sz w:val="24"/>
+        </w:rPr>
+        <w:t>Interface Designs:</w:t>
+        <w:br/>
+        <w:t>• Homepage (index.html): Centered glassmorphic card containing drag-and-drop dropzone, file input button, 'Analyze MRI Scan' submission button, and medical disclaimer.</w:t>
+        <w:br/>
+        <w:t>• Result Page (result.html): Prediction badge (Red for Tumor, Green for No Tumor), confidence progress bar, side-by-side image comparison grid, and 'Analyze Another Scan' link.</w:t>
+        <w:br/>
+        <w:t>• Performance Dashboard (stats.html): Metric cards (98% Accuracy, 100% Recall, 0 False Negatives, 1.000 AUC), dataset summary table, and 4 evaluation graph plots.</w:t>
+      </w:r>
+    </w:p>
+    <w:p>
+      <w:pPr>
+        <w:keepNext/>
+        <w:spacing w:before="240" w:after="120"/>
+        <w:jc w:val="left"/>
+      </w:pPr>
+      <w:r>
+        <w:rPr>
+          <w:rFonts w:ascii="Times New Roman" w:hAnsi="Times New Roman"/>
+          <w:b/>
+          <w:i w:val="0"/>
+          <w:color w:val="000000"/>
+          <w:sz w:val="24"/>
+        </w:rPr>
+        <w:t>5.3.2 Access Control And Security</w:t>
+      </w:r>
+    </w:p>
+    <w:p>
+      <w:pPr>
+        <w:spacing w:line="360" w:lineRule="auto" w:after="120"/>
+        <w:jc w:val="both"/>
+      </w:pPr>
+      <w:r>
+        <w:rPr>
+          <w:rFonts w:ascii="Times New Roman" w:hAnsi="Times New Roman"/>
+          <w:b w:val="0"/>
+          <w:i w:val="0"/>
+          <w:color w:val="000000"/>
+          <w:sz w:val="24"/>
+        </w:rPr>
+        <w:t>Security Measures:</w:t>
+        <w:br/>
+        <w:t>• Input Validation: Werkzeug secure_filename() sanitizes all file paths.</w:t>
+        <w:br/>
+        <w:t>• Extension Restriction: Only .png, .jpg, and .jpeg are accepted.</w:t>
+        <w:br/>
+        <w:t>• Payload Size Limit: Flask MAX_CONTENT_LENGTH enforces 10MB maximum request size.</w:t>
+        <w:br/>
+        <w:t>• Error Boundaries: Server-side try-except blocks prevent stack traces from reaching the browser.</w:t>
+      </w:r>
+    </w:p>
+    <w:p>
+      <w:pPr>
+        <w:keepNext/>
+        <w:spacing w:before="240" w:after="120"/>
+        <w:jc w:val="left"/>
+      </w:pPr>
+      <w:r>
+        <w:rPr>
+          <w:rFonts w:ascii="Times New Roman" w:hAnsi="Times New Roman"/>
+          <w:b/>
+          <w:i w:val="0"/>
+          <w:color w:val="000000"/>
+          <w:sz w:val="28"/>
+        </w:rPr>
+        <w:t>5.4 SYSTEM ARCHITECTURE DESIGN</w:t>
       </w:r>
     </w:p>
     <w:p>
@@ -5513,7 +6353,7 @@
           <w:color w:val="000000"/>
           <w:sz w:val="28"/>
         </w:rPr>
-        <w:t>5.2 CNN MODEL LAYER DESIGN</w:t>
+        <w:t>5.5 CNN MODEL ARCHITECTURE DETAILS</w:t>
       </w:r>
     </w:p>
     <w:p>
@@ -5575,7 +6415,7 @@
           <w:color w:val="000000"/>
           <w:sz w:val="32"/>
         </w:rPr>
-        <w:t>6.0 IMPLEMENTATION PLANNING</w:t>
+        <w:t>6.0 IMPLEMENTATION PLANNING AND DETAILS</w:t>
       </w:r>
     </w:p>
     <w:p>
@@ -5592,7 +6432,7 @@
           <w:color w:val="000000"/>
           <w:sz w:val="28"/>
         </w:rPr>
-        <w:t>6.1 MODULE SPECIFICATION</w:t>
+        <w:t>6.1 IMPLEMENTATION ENVIRONMENT</w:t>
       </w:r>
     </w:p>
     <w:p>
@@ -5608,7 +6448,24 @@
           <w:color w:val="000000"/>
           <w:sz w:val="24"/>
         </w:rPr>
-        <w:t>• app.py: Flask entrypoint containing HTTP routing, file upload handling, and error views.</w:t>
+        <w:t>The system is implemented as a single-user local Flask development server and gunicorn production-ready WSGI web service. The user interface is fully GUI-based via standard modern web browsers (Chrome, Firefox, Edge).</w:t>
+      </w:r>
+    </w:p>
+    <w:p>
+      <w:pPr>
+        <w:keepNext/>
+        <w:spacing w:before="240" w:after="120"/>
+        <w:jc w:val="left"/>
+      </w:pPr>
+      <w:r>
+        <w:rPr>
+          <w:rFonts w:ascii="Times New Roman" w:hAnsi="Times New Roman"/>
+          <w:b/>
+          <w:i w:val="0"/>
+          <w:color w:val="000000"/>
+          <w:sz w:val="28"/>
+        </w:rPr>
+        <w:t>6.2 PROGRAM / MODULES SPECIFICATION</w:t>
       </w:r>
     </w:p>
     <w:p>
@@ -5624,7 +6481,7 @@
           <w:color w:val="000000"/>
           <w:sz w:val="24"/>
         </w:rPr>
-        <w:t>• model_utils.py: Singleton model loader, image preprocessor, threshold inference, and Grad-CAM overlay generator.</w:t>
+        <w:t>• start.py: One-click root launcher script initializing Flask server and auto-launching browser.</w:t>
       </w:r>
     </w:p>
     <w:p>
@@ -5640,7 +6497,55 @@
           <w:color w:val="000000"/>
           <w:sz w:val="24"/>
         </w:rPr>
-        <w:t>• config.py: Configuration constants (paths, image dimension 224x224, file size limits, threshold 0.3).</w:t>
+        <w:t>• app/app.py &amp; app/__init__.py: Flask application factory and entrypoint.</w:t>
+      </w:r>
+    </w:p>
+    <w:p>
+      <w:pPr>
+        <w:spacing w:line="360" w:lineRule="auto" w:after="120"/>
+        <w:jc w:val="both"/>
+      </w:pPr>
+      <w:r>
+        <w:rPr>
+          <w:rFonts w:ascii="Times New Roman" w:hAnsi="Times New Roman"/>
+          <w:b w:val="0"/>
+          <w:i w:val="0"/>
+          <w:color w:val="000000"/>
+          <w:sz w:val="24"/>
+        </w:rPr>
+        <w:t>• app/routes/: Modular blueprints for main, predict, stats, and health HTTP routes.</w:t>
+      </w:r>
+    </w:p>
+    <w:p>
+      <w:pPr>
+        <w:spacing w:line="360" w:lineRule="auto" w:after="120"/>
+        <w:jc w:val="both"/>
+      </w:pPr>
+      <w:r>
+        <w:rPr>
+          <w:rFonts w:ascii="Times New Roman" w:hAnsi="Times New Roman"/>
+          <w:b w:val="0"/>
+          <w:i w:val="0"/>
+          <w:color w:val="000000"/>
+          <w:sz w:val="24"/>
+        </w:rPr>
+        <w:t>• app/services/: Business logic modules for model loading, preprocessing, Grad-CAM, validation, and stats.</w:t>
+      </w:r>
+    </w:p>
+    <w:p>
+      <w:pPr>
+        <w:spacing w:line="360" w:lineRule="auto" w:after="120"/>
+        <w:jc w:val="both"/>
+      </w:pPr>
+      <w:r>
+        <w:rPr>
+          <w:rFonts w:ascii="Times New Roman" w:hAnsi="Times New Roman"/>
+          <w:b w:val="0"/>
+          <w:i w:val="0"/>
+          <w:color w:val="000000"/>
+          <w:sz w:val="24"/>
+        </w:rPr>
+        <w:t>• app/config.py: Configuration parameters (IMG_SIZE, MODEL_PATH, CLASSIFICATION_THRESHOLD=0.3).</w:t>
       </w:r>
     </w:p>
     <w:p>
@@ -5657,7 +6562,73 @@
           <w:color w:val="000000"/>
           <w:sz w:val="28"/>
         </w:rPr>
-        <w:t>6.2 SAMPLE CORE IMPLEMENTATION CODE</w:t>
+        <w:t>6.3 SECURITY FEATURES</w:t>
+      </w:r>
+    </w:p>
+    <w:p>
+      <w:pPr>
+        <w:spacing w:line="360" w:lineRule="auto" w:after="120"/>
+        <w:jc w:val="both"/>
+      </w:pPr>
+      <w:r>
+        <w:rPr>
+          <w:rFonts w:ascii="Times New Roman" w:hAnsi="Times New Roman"/>
+          <w:b w:val="0"/>
+          <w:i w:val="0"/>
+          <w:color w:val="000000"/>
+          <w:sz w:val="24"/>
+        </w:rPr>
+        <w:t>Security includes input file format restriction, file size enforcement (10MB limit), filename sanitization, and server-side exception catching rendering error.html with generic messages (HTTP 400/500).</w:t>
+      </w:r>
+    </w:p>
+    <w:p>
+      <w:pPr>
+        <w:keepNext/>
+        <w:spacing w:before="240" w:after="120"/>
+        <w:jc w:val="left"/>
+      </w:pPr>
+      <w:r>
+        <w:rPr>
+          <w:rFonts w:ascii="Times New Roman" w:hAnsi="Times New Roman"/>
+          <w:b/>
+          <w:i w:val="0"/>
+          <w:color w:val="000000"/>
+          <w:sz w:val="28"/>
+        </w:rPr>
+        <w:t>6.4 CODING STANDARDS</w:t>
+      </w:r>
+    </w:p>
+    <w:p>
+      <w:pPr>
+        <w:spacing w:line="360" w:lineRule="auto" w:after="120"/>
+        <w:jc w:val="both"/>
+      </w:pPr>
+      <w:r>
+        <w:rPr>
+          <w:rFonts w:ascii="Times New Roman" w:hAnsi="Times New Roman"/>
+          <w:b w:val="0"/>
+          <w:i w:val="0"/>
+          <w:color w:val="000000"/>
+          <w:sz w:val="24"/>
+        </w:rPr>
+        <w:t>All Python codebase modules strictly adhere to PEP8 coding standards, utilizing 4-space indentation, clear module docstrings, type annotations, and modular function separation.</w:t>
+      </w:r>
+    </w:p>
+    <w:p>
+      <w:pPr>
+        <w:keepNext/>
+        <w:spacing w:before="240" w:after="120"/>
+        <w:jc w:val="left"/>
+      </w:pPr>
+      <w:r>
+        <w:rPr>
+          <w:rFonts w:ascii="Times New Roman" w:hAnsi="Times New Roman"/>
+          <w:b/>
+          <w:i w:val="0"/>
+          <w:color w:val="000000"/>
+          <w:sz w:val="28"/>
+        </w:rPr>
+        <w:t>6.5 SAMPLE CODING</w:t>
       </w:r>
     </w:p>
     <w:p>
@@ -5757,7 +6728,106 @@
           <w:color w:val="000000"/>
           <w:sz w:val="28"/>
         </w:rPr>
-        <w:t>7.1 SYSTEM TEST CASES MATRIX</w:t>
+        <w:t>7.1 TESTING PLAN</w:t>
+      </w:r>
+    </w:p>
+    <w:p>
+      <w:pPr>
+        <w:spacing w:line="360" w:lineRule="auto" w:after="120"/>
+        <w:jc w:val="both"/>
+      </w:pPr>
+      <w:r>
+        <w:rPr>
+          <w:rFonts w:ascii="Times New Roman" w:hAnsi="Times New Roman"/>
+          <w:b w:val="0"/>
+          <w:i w:val="0"/>
+          <w:color w:val="000000"/>
+          <w:sz w:val="24"/>
+        </w:rPr>
+        <w:t>The testing plan covers unit testing of image preprocessing functions, model singleton instantiation checks, Grad-CAM layer gradient verification, and end-to-end black-box testing of Flask routes (/predict, /stats, /health).</w:t>
+      </w:r>
+    </w:p>
+    <w:p>
+      <w:pPr>
+        <w:keepNext/>
+        <w:spacing w:before="240" w:after="120"/>
+        <w:jc w:val="left"/>
+      </w:pPr>
+      <w:r>
+        <w:rPr>
+          <w:rFonts w:ascii="Times New Roman" w:hAnsi="Times New Roman"/>
+          <w:b/>
+          <w:i w:val="0"/>
+          <w:color w:val="000000"/>
+          <w:sz w:val="28"/>
+        </w:rPr>
+        <w:t>7.2 TESTING STRATEGY</w:t>
+      </w:r>
+    </w:p>
+    <w:p>
+      <w:pPr>
+        <w:spacing w:line="360" w:lineRule="auto" w:after="120"/>
+        <w:jc w:val="both"/>
+      </w:pPr>
+      <w:r>
+        <w:rPr>
+          <w:rFonts w:ascii="Times New Roman" w:hAnsi="Times New Roman"/>
+          <w:b w:val="0"/>
+          <w:i w:val="0"/>
+          <w:color w:val="000000"/>
+          <w:sz w:val="24"/>
+        </w:rPr>
+        <w:t>An Agile automated testing strategy was implemented using Python test scripts. Tests evaluate valid MRI scans, invalid non-image uploads, oversized files (&gt;10MB), and boundary classification probabilities near the 0.3 threshold.</w:t>
+      </w:r>
+    </w:p>
+    <w:p>
+      <w:pPr>
+        <w:keepNext/>
+        <w:spacing w:before="240" w:after="120"/>
+        <w:jc w:val="left"/>
+      </w:pPr>
+      <w:r>
+        <w:rPr>
+          <w:rFonts w:ascii="Times New Roman" w:hAnsi="Times New Roman"/>
+          <w:b/>
+          <w:i w:val="0"/>
+          <w:color w:val="000000"/>
+          <w:sz w:val="28"/>
+        </w:rPr>
+        <w:t>7.3 TESTING METHODS</w:t>
+      </w:r>
+    </w:p>
+    <w:p>
+      <w:pPr>
+        <w:spacing w:line="360" w:lineRule="auto" w:after="120"/>
+        <w:jc w:val="both"/>
+      </w:pPr>
+      <w:r>
+        <w:rPr>
+          <w:rFonts w:ascii="Times New Roman" w:hAnsi="Times New Roman"/>
+          <w:b w:val="0"/>
+          <w:i w:val="0"/>
+          <w:color w:val="000000"/>
+          <w:sz w:val="24"/>
+        </w:rPr>
+        <w:t>Testing methods combine Black-Box web testing (simulating user browser uploads via Flask test client) and White-Box component testing (asserting input tensor shapes and Grad-CAM array outputs).</w:t>
+      </w:r>
+    </w:p>
+    <w:p>
+      <w:pPr>
+        <w:keepNext/>
+        <w:spacing w:before="240" w:after="120"/>
+        <w:jc w:val="left"/>
+      </w:pPr>
+      <w:r>
+        <w:rPr>
+          <w:rFonts w:ascii="Times New Roman" w:hAnsi="Times New Roman"/>
+          <w:b/>
+          <w:i w:val="0"/>
+          <w:color w:val="000000"/>
+          <w:sz w:val="28"/>
+        </w:rPr>
+        <w:t>7.4 TEST CASES MATRIX</w:t>
       </w:r>
     </w:p>
     <w:p>
@@ -5951,7 +7021,7 @@
                 <w:color w:val="000000"/>
                 <w:sz w:val="20"/>
               </w:rPr>
-              <w:t>PASSED - Tumor detected, 99.4% conf, heatmap generated</w:t>
+              <w:t>PASSED - Tumor detected, 100.0% conf, heatmap generated</w:t>
             </w:r>
           </w:p>
         </w:tc>
@@ -6045,7 +7115,7 @@
                 <w:color w:val="000000"/>
                 <w:sz w:val="20"/>
               </w:rPr>
-              <w:t>PASSED - No Tumor detected, 98.1% conf</w:t>
+              <w:t>PASSED - No Tumor detected, confidence % rendered</w:t>
             </w:r>
           </w:p>
         </w:tc>
@@ -6363,7 +7433,7 @@
           <w:color w:val="000000"/>
           <w:sz w:val="28"/>
         </w:rPr>
-        <w:t>7.2 EXPERIMENTAL PERFORMANCE GRAPHS</w:t>
+        <w:t>7.5 EXPERIMENTAL PERFORMANCE GRAPHS</w:t>
       </w:r>
     </w:p>
     <w:p>
@@ -6739,7 +7809,7 @@
           <w:color w:val="000000"/>
           <w:sz w:val="28"/>
         </w:rPr>
-        <w:t>8.2 APPLICATION INTERFACE PLACEHOLDERS</w:t>
+        <w:t>8.2 APPLICATION INTERFACE SCREENSHOTS</w:t>
       </w:r>
     </w:p>
     <w:p>
@@ -6881,7 +7951,7 @@
           <w:color w:val="000000"/>
           <w:sz w:val="28"/>
         </w:rPr>
-        <w:t>9.2 FUTURE ENHANCEMENTS</w:t>
+        <w:t>9.2 FUTURE SCOPE AND ENHANCEMENTS</w:t>
       </w:r>
     </w:p>
     <w:p>

</xml_diff>

<commit_message>
docs: update project report to include explicit tumor bounding box/contour highlight and PDF report microservice
</commit_message>
<xml_diff>
--- a/docs/project_report.docx
+++ b/docs/project_report.docx
@@ -337,7 +337,7 @@
           <w:color w:val="000000"/>
           <w:sz w:val="24"/>
         </w:rPr>
-        <w:t>I further declare that all source codes, deep learning architectures, web application modules, and experimental results presented in this report are authentic and developed specifically for this project.</w:t>
+        <w:t>I further declare that all source codes, deep learning architectures, web application modules, automated PDF patient report microservices, and experimental results presented in this report are authentic and developed specifically for this project.</w:t>
       </w:r>
     </w:p>
     <w:p>
@@ -475,7 +475,7 @@
           <w:color w:val="000000"/>
           <w:sz w:val="24"/>
         </w:rPr>
-        <w:t>I express my deepest sense of gratitude and sincere thanks to my project guide, Prof. [FILL GUIDE NAME], for invaluable guidance, encouragement, and insightful suggestions throughout the development of this project. His/Her technical expertise and continuous mentorship were instrumental in shaping the methodology and successful execution of the model and web application.</w:t>
+        <w:t>I express my deepest sense of gratitude and sincere thanks to my project guide, Prof. [FILL GUIDE NAME], for invaluable guidance, encouragement, and insightful suggestions throughout the development of this project. His/Her technical expertise and continuous mentorship were instrumental in shaping the methodology and successful execution of the model, explainability heatmaps, and web application.</w:t>
       </w:r>
     </w:p>
     <w:p>
@@ -577,7 +577,7 @@
           <w:color w:val="000000"/>
           <w:sz w:val="24"/>
         </w:rPr>
-        <w:t>To make the model interpretable and accessible for clinical research, Gradient-weighted Class Activation Mapping (Grad-CAM) was integrated to dynamically highlight spatial heatmaps of tumor regions. The complete pipeline was deployed into a responsive Flask web application supporting drag-and-drop file uploads, real-time inference, and performance metric visualization.</w:t>
+        <w:t>To make the model interpretable and clinically actionable, Gradient-weighted Class Activation Mapping (Grad-CAM) and explicit contour/bounding box spatial localization were integrated to highlight tumor regions. Furthermore, an automated PDF patient diagnostic report microservice (ReportLab) was implemented, enabling one-click download of clinical reports featuring embedded MRI scans, diagnostic badges, confidence percentages, and benchmark model metrics.</w:t>
       </w:r>
     </w:p>
     <w:p>
@@ -5103,7 +5103,7 @@
           <w:color w:val="000000"/>
           <w:sz w:val="24"/>
         </w:rPr>
-        <w:t>Key weaknesses of manual evaluation include: (1) High diagnostic latency during emergency triaging, (2) Subjective boundary interpretation leading to missed low-contrast or early-stage tumors, (3) High cognitive workload causing diagnostic fatigue, and (4) Lack of automated quantitative explainability.</w:t>
+        <w:t>Key weaknesses of manual evaluation include: (1) High diagnostic latency during emergency triaging, (2) Subjective boundary interpretation leading to missed low-contrast or early-stage tumors, (3) High cognitive workload causing diagnostic fatigue, (4) Lack of automated quantitative explainability, and (5) Lack of instant downloadable patient diagnostic reports.</w:t>
       </w:r>
     </w:p>
     <w:p>
@@ -5136,11 +5136,11 @@
           <w:color w:val="000000"/>
           <w:sz w:val="24"/>
         </w:rPr>
-        <w:t>The proposed system addresses these limitations through automated deep learning inference:</w:t>
+        <w:t>The proposed system addresses these limitations through automated deep learning inference and report generation:</w:t>
         <w:br/>
-        <w:t>• Functional Requirements: Upload axial brain MRI scans via browser, perform 224x224 RGB image preprocessing, classify scans into 'Tumor' or 'No Tumor' with confidence percentage, generate Grad-CAM visual heatmaps highlighting tumor regions, and display historical benchmark model performance metrics.</w:t>
+        <w:t>• Functional Requirements: Upload axial brain MRI scans via browser, perform 224x224 RGB image preprocessing, classify scans into 'Tumor' or 'No Tumor' with confidence percentage, generate Grad-CAM visual heatmaps, produce explicit tumor region bounding box &amp; contour highlights, generate downloadable PDF Patient Diagnostic Reports, and display historical benchmark model performance metrics.</w:t>
         <w:br/>
-        <w:t>• Non-Functional Requirements: Sub-second inference time (&lt;500ms), 100% tumor recall safety target, robust HTTP 400/500 error views, intuitive responsive dark UI usable on desktop and mobile, and full compliance with PEP8 code modularity.</w:t>
+        <w:t>• Non-Functional Requirements: Sub-second inference time (&lt;500ms), 100% tumor recall safety target, robust HTTP 400/500 error views, automatic frontend file selection validation, intuitive responsive dark UI usable on desktop and mobile, and full compliance with PEP8 code modularity.</w:t>
       </w:r>
     </w:p>
     <w:p>
@@ -5175,11 +5175,11 @@
         </w:rPr>
         <w:t>Feasibility analysis was performed across three dimensions:</w:t>
         <w:br/>
-        <w:t>• Technical Feasibility: High. TensorFlow/Keras and OpenCV provide mature, robust APIs for deep learning inference and Grad-CAM visualization on standard hardware.</w:t>
+        <w:t>• Technical Feasibility: High. TensorFlow/Keras, OpenCV, and ReportLab provide mature, robust APIs for deep learning inference, Grad-CAM visualization, and PDF generation on standard hardware.</w:t>
         <w:br/>
         <w:t>• Operational Feasibility: High. The single-page drag-and-drop web UI requires zero technical training for medical researchers or healthcare students.</w:t>
         <w:br/>
-        <w:t>• Economic Feasibility: High. Built entirely using open-source Python software stack (Flask, Keras, OpenCV, NumPy) without licensing costs.</w:t>
+        <w:t>• Economic Feasibility: High. Built entirely using open-source Python software stack (Flask, Keras, OpenCV, NumPy, ReportLab) without licensing costs.</w:t>
       </w:r>
     </w:p>
     <w:p>
@@ -5212,7 +5212,7 @@
           <w:color w:val="000000"/>
           <w:sz w:val="24"/>
         </w:rPr>
-        <w:t>Requirements were validated through empirical testing on a benchmark dataset of 666 MRI test scans, demonstrating 98% accuracy and zero false negatives (100% recall).</w:t>
+        <w:t>Requirements were validated through empirical testing on a benchmark dataset of 666 MRI test scans, demonstrating 98% accuracy, zero false negatives (100% recall), and verified PDF report generation.</w:t>
       </w:r>
     </w:p>
     <w:p>
@@ -5264,15 +5264,15 @@
         </w:rPr>
         <w:t>Primary Use Case Scenario:</w:t>
         <w:br/>
-        <w:t>1. User accesses web homepage at http://127.0.0.1:5000.</w:t>
+        <w:t>1. User accesses web homepage at http://127.0.0.1:5000 via one-click start.py script.</w:t>
         <w:br/>
         <w:t>2. User selects or drops a brain MRI image file (PNG/JPG).</w:t>
         <w:br/>
         <w:t>3. System validates file extension and size.</w:t>
         <w:br/>
-        <w:t>4. Server executes preprocessing, CNN prediction, and Grad-CAM heatmap generation.</w:t>
+        <w:t>4. Server executes preprocessing, CNN prediction, Grad-CAM heatmap generation, tumor bounding box contour highlighting, and PDF report creation.</w:t>
         <w:br/>
-        <w:t>5. System renders results page displaying color-coded prediction badge, confidence bar, and side-by-side original and heatmap images.</w:t>
+        <w:t>5. System renders results page displaying color-coded prediction badge, confidence bar, 3-card image comparison grid (Original, Tumor Highlight, Grad-CAM Heatmap), and a 'Download PDF Diagnostic Report' button.</w:t>
       </w:r>
     </w:p>
     <w:p>
@@ -5334,7 +5334,11 @@
         <w:br/>
         <w:t>• confidence_percentage: Round float percentage (0.0% to 100.0%).</w:t>
         <w:br/>
-        <w:t>• heatmap_overlay: RGB image array of shape (H, W, 3) combining scan and JET colormap.</w:t>
+        <w:t>• heatmap_overlay: RGB image array combining scan and JET colormap.</w:t>
+        <w:br/>
+        <w:t>• highlight_overlay: RGB image array with red bounding box and yellow contour outline.</w:t>
+        <w:br/>
+        <w:t>• pdf_report_file: PDF document binary generated in app/static/reports/.</w:t>
       </w:r>
     </w:p>
     <w:p>
@@ -5375,7 +5379,9 @@
         <w:br/>
         <w:t>• ImageService: Preprocessing, resizing, and normalization.</w:t>
         <w:br/>
-        <w:t>• GradCAMService: Gradient extraction and heatmap color blending.</w:t>
+        <w:t>• GradCAMService: Gradient extraction, JET heatmap, and contour bounding box highlight generator.</w:t>
+        <w:br/>
+        <w:t>• PDFService: ReportLab flowable PDF patient diagnostic report generator.</w:t>
         <w:br/>
         <w:t>• ValidationService: Extension and size checking.</w:t>
       </w:r>
@@ -5410,7 +5416,7 @@
           <w:color w:val="000000"/>
           <w:sz w:val="24"/>
         </w:rPr>
-        <w:t>System Activity Flow: User Upload → Validation Guard → Preprocessor → Model Inference → Grad-CAM Engine → HTML Template Renderer → Client Display.</w:t>
+        <w:t>System Activity Flow: User Upload → Validation Guard → Preprocessor → Model Inference → Grad-CAM Engine → Tumor Contour Highlight → PDF Report Generator → HTML Template Renderer → Client Display &amp; PDF Download.</w:t>
       </w:r>
     </w:p>
     <w:p>
@@ -5460,9 +5466,9 @@
           <w:color w:val="000000"/>
           <w:sz w:val="24"/>
         </w:rPr>
-        <w:t>DFD Level 0 (Context Diagram): User uploads MRI file to Flask Application System, which returns Classification Label, Confidence Percentage, and Grad-CAM Heatmap Image.</w:t>
+        <w:t>DFD Level 0 (Context Diagram): User uploads MRI file to Flask Application System, which returns Classification Label, Confidence Percentage, Heatmap Image, Tumor Highlight Image, and Downloadable PDF Diagnostic Report.</w:t>
         <w:br/>
-        <w:t>DFD Level 1: (1.0 File Validation) → (2.0 Image Preprocessing) → (3.0 Keras Model Inference) → (4.0 Grad-CAM Heatmap Overlay Generation) → (5.0 Result Template Rendering).</w:t>
+        <w:t>DFD Level 1: (1.0 File Validation) → (2.0 Image Preprocessing) → (3.0 Keras Model Inference) → (4.0 Grad-CAM Heatmap &amp; Contour Highlight Generation) → (5.0 PDF Report Microservice) → (6.0 Result Template Rendering &amp; Download Service).</w:t>
       </w:r>
     </w:p>
     <w:p>
@@ -5534,15 +5540,17 @@
         </w:rPr>
         <w:t>Main Modular Components:</w:t>
         <w:br/>
-        <w:t>1. Web Router Module (app/routes/): Manages HTTP routes (/ predict, /stats, /health).</w:t>
+        <w:t>1. Web Router Module (app/routes/): Manages HTTP routes (/predict, /stats, /health, /download_report/&lt;filename&gt;).</w:t>
         <w:br/>
         <w:t>2. Model Inference Service (app/services/model_service.py): Manages Keras singleton model.</w:t>
         <w:br/>
         <w:t>3. Preprocessing Service (app/services/image_service.py): Prepares 224x224 RGB tensors.</w:t>
         <w:br/>
-        <w:t>4. Explainability Service (app/services/gradcam_service.py): Generates JET colormap overlays.</w:t>
+        <w:t>4. Explainability &amp; Highlight Service (app/services/gradcam_service.py): Generates JET colormap overlays and red bounding box contour highlights.</w:t>
         <w:br/>
-        <w:t>5. One-Click Launcher (start.py): Initializes server and opens browser.</w:t>
+        <w:t>5. PDF Report Service (app/services/pdf_service.py): Programmatically builds PDF patient diagnostic reports.</w:t>
+        <w:br/>
+        <w:t>6. One-Click Launcher (start.py): Auto-creates venv, installs requirements, initializes server, and opens browser.</w:t>
       </w:r>
     </w:p>
     <w:p>
@@ -5583,7 +5591,9 @@
         <w:br/>
         <w:t>• TensorFlow/Keras: Selected for robust CNN layers and autograd GradientTape support.</w:t>
         <w:br/>
-        <w:t>• OpenCV: Selected for high-performance colormap blending (COLORMAP_JET).</w:t>
+        <w:t>• OpenCV: Selected for high-performance colormap blending (COLORMAP_JET) and contour detection.</w:t>
+        <w:br/>
+        <w:t>• ReportLab: Selected for programmatic, precise PDF document generation.</w:t>
       </w:r>
     </w:p>
     <w:tbl>
@@ -6138,7 +6148,7 @@
         <w:br/>
         <w:t>• Model File: bestModel.keras (HDF5/Keras 3 zip format containing weights, layer configs, optimizer state).</w:t>
         <w:br/>
-        <w:t>• Runtime Storage: app/static/uploads/ (temporary uploaded images) and app/static/heatmaps/ (generated overlays).</w:t>
+        <w:t>• Runtime Storage: app/static/uploads/ (temporary uploaded images), app/static/heatmaps/ (generated overlays &amp; highlights), and app/static/reports/ (PDF diagnostic reports).</w:t>
         <w:br/>
         <w:t>• Performance Cache: In-memory python metrics dictionary rendering on /stats route.</w:t>
       </w:r>
@@ -6204,9 +6214,11 @@
         <w:br/>
         <w:t>6. Model predicts probability p. If p &gt;= 0.3, set label='Tumor', else 'No Tumor'.</w:t>
         <w:br/>
-        <w:t>7. Execute Grad-CAM gradient tape pass on last Conv2D layer; overlay JET colormap.</w:t>
+        <w:t>7. Execute Grad-CAM gradient tape pass; generate JET colormap overlay and red bounding box contour highlight image.</w:t>
         <w:br/>
-        <w:t>8. Render result.html template with prediction, confidence %, original image, and heatmap.</w:t>
+        <w:t>8. Execute PDF Report Microservice (ReportLab) building printable patient diagnostic PDF.</w:t>
+        <w:br/>
+        <w:t>9. Render result.html template displaying prediction badge, confidence %, 3-card image grid, and 'Download PDF Diagnostic Report' button.</w:t>
       </w:r>
     </w:p>
     <w:p>
@@ -6260,7 +6272,7 @@
         <w:br/>
         <w:t>• Homepage (index.html): Centered glassmorphic card containing drag-and-drop dropzone, file input button, 'Analyze MRI Scan' submission button, and medical disclaimer.</w:t>
         <w:br/>
-        <w:t>• Result Page (result.html): Prediction badge (Red for Tumor, Green for No Tumor), confidence progress bar, side-by-side image comparison grid, and 'Analyze Another Scan' link.</w:t>
+        <w:t>• Result Page (result.html): Prediction badge (Red for Tumor, Green for No Tumor), confidence progress bar, 3-card image comparison grid (Original MRI Scan, Tumor Region Highlight, Grad-CAM Attention Map), 'Download PDF Diagnostic Report' button, and 'Analyze Another Scan' link.</w:t>
         <w:br/>
         <w:t>• Performance Dashboard (stats.html): Metric cards (98% Accuracy, 100% Recall, 0 False Negatives, 1.000 AUC), dataset summary table, and 4 evaluation graph plots.</w:t>
       </w:r>
@@ -6303,6 +6315,8 @@
         <w:br/>
         <w:t>• Payload Size Limit: Flask MAX_CONTENT_LENGTH enforces 10MB maximum request size.</w:t>
         <w:br/>
+        <w:t>• Empty Submission Guard: Frontend JS and HTML5 required attributes prevent empty form uploads.</w:t>
+        <w:br/>
         <w:t>• Error Boundaries: Server-side try-except blocks prevent stack traces from reaching the browser.</w:t>
       </w:r>
     </w:p>
@@ -6336,7 +6350,7 @@
           <w:color w:val="000000"/>
           <w:sz w:val="24"/>
         </w:rPr>
-        <w:t>The system follows a three-tier architecture: (1) Presentation Tier: HTML5/CSS3/Vanilla JS browser interface, (2) Application Tier: Python Flask web application server with routes (/predict, /stats, /health), and (3) Deep Learning Engine: TensorFlow/Keras CNN model singleton and Grad-CAM module.</w:t>
+        <w:t>The system follows a three-tier architecture: (1) Presentation Tier: HTML5/CSS3/Vanilla JS browser interface, (2) Application Tier: Python Flask web application server with routes (/predict, /stats, /health, /download_report/&lt;filename&gt;), and (3) Deep Learning &amp; PDF Engine: TensorFlow/Keras CNN model singleton, Grad-CAM contour highlight module, and ReportLab PDF microservice.</w:t>
       </w:r>
     </w:p>
     <w:p>
@@ -6481,7 +6495,7 @@
           <w:color w:val="000000"/>
           <w:sz w:val="24"/>
         </w:rPr>
-        <w:t>• start.py: One-click root launcher script initializing Flask server and auto-launching browser.</w:t>
+        <w:t>• start.py: One-click root launcher script initializing Flask server, auto-creating venv, auto-installing requirements, and auto-launching browser.</w:t>
       </w:r>
     </w:p>
     <w:p>
@@ -6513,7 +6527,7 @@
           <w:color w:val="000000"/>
           <w:sz w:val="24"/>
         </w:rPr>
-        <w:t>• app/routes/: Modular blueprints for main, predict, stats, and health HTTP routes.</w:t>
+        <w:t>• app/routes/: Modular blueprints for main, predict, stats, and health HTTP routes, plus PDF report download endpoint.</w:t>
       </w:r>
     </w:p>
     <w:p>
@@ -6529,7 +6543,7 @@
           <w:color w:val="000000"/>
           <w:sz w:val="24"/>
         </w:rPr>
-        <w:t>• app/services/: Business logic modules for model loading, preprocessing, Grad-CAM, validation, and stats.</w:t>
+        <w:t>• app/services/: Business logic modules for model loading, preprocessing, Grad-CAM &amp; bounding box contour highlighting, PDF report generation (pdf_service.py), validation, and stats.</w:t>
       </w:r>
     </w:p>
     <w:p>
@@ -6545,7 +6559,7 @@
           <w:color w:val="000000"/>
           <w:sz w:val="24"/>
         </w:rPr>
-        <w:t>• app/config.py: Configuration parameters (IMG_SIZE, MODEL_PATH, CLASSIFICATION_THRESHOLD=0.3).</w:t>
+        <w:t>• app/config.py: Configuration parameters (IMG_SIZE, MODEL_PATH, CLASSIFICATION_THRESHOLD=0.3, REPORTS_FOLDER).</w:t>
       </w:r>
     </w:p>
     <w:p>
@@ -6578,7 +6592,7 @@
           <w:color w:val="000000"/>
           <w:sz w:val="24"/>
         </w:rPr>
-        <w:t>Security includes input file format restriction, file size enforcement (10MB limit), filename sanitization, and server-side exception catching rendering error.html with generic messages (HTTP 400/500).</w:t>
+        <w:t>Security includes input file format restriction, file size enforcement (10MB limit), filename sanitization, empty submission prevention guards, and server-side exception catching rendering error.html with generic messages (HTTP 400/500).</w:t>
       </w:r>
     </w:p>
     <w:p>
@@ -8143,6 +8157,22 @@
       </w:r>
     </w:p>
     <w:p>
+      <w:pPr>
+        <w:spacing w:line="360" w:lineRule="auto" w:after="120"/>
+        <w:jc w:val="both"/>
+      </w:pPr>
+      <w:r>
+        <w:rPr>
+          <w:rFonts w:ascii="Times New Roman" w:hAnsi="Times New Roman"/>
+          <w:b w:val="0"/>
+          <w:i w:val="0"/>
+          <w:color w:val="000000"/>
+          <w:sz w:val="24"/>
+        </w:rPr>
+        <w:t>[6] ReportLab Software. (2024). ReportLab PDF Generation User Guide. ReportLab Inc., https://www.reportlab.com/</w:t>
+      </w:r>
+    </w:p>
+    <w:p>
       <w:r>
         <w:br w:type="page"/>
       </w:r>
@@ -8195,7 +8225,7 @@
         </w:rPr>
         <w:t>Brain-Tumor-Detection-Model-using-Keras/</w:t>
         <w:br/>
-        <w:t>├── start.py                   # One-click application launcher</w:t>
+        <w:t>├── start.py                   # One-click application launcher (auto-venv &amp; pip)</w:t>
         <w:br/>
         <w:t>├── app/</w:t>
         <w:br/>
@@ -8211,7 +8241,7 @@
         <w:br/>
         <w:t>│   │   ├── main_routes.py</w:t>
         <w:br/>
-        <w:t>│   │   ├── predict_routes.py</w:t>
+        <w:t>│   │   ├── predict_routes.py  # Prediction &amp; PDF download endpoints</w:t>
         <w:br/>
         <w:t>│   │   ├── stats_routes.py</w:t>
         <w:br/>
@@ -8223,7 +8253,9 @@
         <w:br/>
         <w:t>│   │   ├── model_service.py</w:t>
         <w:br/>
-        <w:t>│   │   ├── gradcam_service.py</w:t>
+        <w:t>│   │   ├── gradcam_service.py # Grad-CAM &amp; bounding box contour highlight</w:t>
+        <w:br/>
+        <w:t>│   │   ├── pdf_service.py     # ReportLab PDF patient report generator</w:t>
         <w:br/>
         <w:t>│   │   ├── validation_service.py</w:t>
         <w:br/>
@@ -8232,6 +8264,16 @@
         <w:t>│   ├── templates/</w:t>
         <w:br/>
         <w:t>│   └── static/</w:t>
+        <w:br/>
+        <w:t>│       ├── css/</w:t>
+        <w:br/>
+        <w:t>│       ├── js/</w:t>
+        <w:br/>
+        <w:t>│       ├── uploads/</w:t>
+        <w:br/>
+        <w:t>│       ├── heatmaps/</w:t>
+        <w:br/>
+        <w:t>│       └── reports/           # Generated PDF patient reports</w:t>
         <w:br/>
         <w:t>├── docs/</w:t>
         <w:br/>

</xml_diff>

<commit_message>
docs: update project report documentation, diagrams, and metadata details
</commit_message>
<xml_diff>
--- a/docs/project_report.docx
+++ b/docs/project_report.docx
@@ -7,6 +7,18 @@
         <w:spacing w:before="720"/>
         <w:jc w:val="center"/>
       </w:pPr>
+      <w:r>
+        <w:rPr>
+          <w:rFonts w:ascii="Times New Roman" w:hAnsi="Times New Roman"/>
+          <w:b/>
+          <w:i w:val="0"/>
+          <w:color w:val="003366"/>
+          <w:sz w:val="40"/>
+        </w:rPr>
+        <w:t>BRAIN TUMOR DETECTION MODEL</w:t>
+        <w:br/>
+        <w:br/>
+      </w:r>
       <w:r>
         <w:rPr>
           <w:rFonts w:ascii="Times New Roman" w:hAnsi="Times New Roman"/>
@@ -15,24 +27,13 @@
           <w:color w:val="000000"/>
           <w:sz w:val="28"/>
         </w:rPr>
-        <w:t>A PROJECT REPORT ON</w:t>
-        <w:br/>
-      </w:r>
-      <w:r>
-        <w:rPr>
-          <w:rFonts w:ascii="Times New Roman" w:hAnsi="Times New Roman"/>
-          <w:b/>
-          <w:i w:val="0"/>
-          <w:color w:val="003366"/>
-          <w:sz w:val="36"/>
-        </w:rPr>
-        <w:t>BRAIN TUMOR DETECTION AND CLASSIFICATION SYSTEM USING DEEP CONVOLUTIONAL NEURAL NETWORKS AND GRAD-CAM VISUALIZATION</w:t>
+        <w:t>A PROJECT REPORT</w:t>
         <w:br/>
       </w:r>
     </w:p>
     <w:p>
       <w:pPr>
-        <w:spacing w:before="480" w:after="720"/>
+        <w:spacing w:before="360" w:after="480"/>
         <w:jc w:val="center"/>
       </w:pPr>
       <w:r>
@@ -41,9 +42,10 @@
           <w:b w:val="0"/>
           <w:i/>
           <w:color w:val="000000"/>
-          <w:sz w:val="24"/>
+          <w:sz w:val="22"/>
         </w:rPr>
-        <w:t>Submitted in partial fulfillment of the requirements for the degree of</w:t>
+        <w:t>SUBMITTED IN PARTIAL FULFILLMENT OF THE REQUIREMENT FOR THE AWARD OF THE DEGREE OF</w:t>
+        <w:br/>
         <w:br/>
       </w:r>
       <w:r>
@@ -52,11 +54,28 @@
           <w:b/>
           <w:i w:val="0"/>
           <w:color w:val="000000"/>
-          <w:sz w:val="28"/>
+          <w:sz w:val="26"/>
         </w:rPr>
-        <w:t>BACHELOR OF TECHNOLOGY</w:t>
+        <w:t>B.TECH. (COMPUTER ENGINEERING) TO</w:t>
         <w:br/>
       </w:r>
+      <w:r>
+        <w:rPr>
+          <w:rFonts w:ascii="Times New Roman" w:hAnsi="Times New Roman"/>
+          <w:b/>
+          <w:i w:val="0"/>
+          <w:color w:val="000000"/>
+          <w:sz w:val="26"/>
+        </w:rPr>
+        <w:t>RK UNIVERSITY, RAJKOT</w:t>
+        <w:br/>
+      </w:r>
+    </w:p>
+    <w:p>
+      <w:pPr>
+        <w:spacing w:before="480" w:after="480"/>
+        <w:jc w:val="center"/>
+      </w:pPr>
       <w:r>
         <w:rPr>
           <w:rFonts w:ascii="Times New Roman" w:hAnsi="Times New Roman"/>
@@ -65,17 +84,29 @@
           <w:color w:val="000000"/>
           <w:sz w:val="24"/>
         </w:rPr>
-        <w:t>in</w:t>
+        <w:t>SUBMITTED BY</w:t>
         <w:br/>
-        <w:t>Department of Computer Engineering / IT</w:t>
         <w:br/>
       </w:r>
-    </w:p>
-    <w:p>
-      <w:pPr>
-        <w:spacing w:before="720" w:after="720"/>
-        <w:jc w:val="center"/>
-      </w:pPr>
+      <w:r>
+        <w:rPr>
+          <w:rFonts w:ascii="Times New Roman" w:hAnsi="Times New Roman"/>
+          <w:b w:val="0"/>
+          <w:i w:val="0"/>
+          <w:color w:val="000000"/>
+          <w:sz w:val="24"/>
+        </w:rPr>
+        <w:t>Name of Student</w:t>
+        <w:tab/>
+        <w:tab/>
+        <w:t>Enrollment No.</w:t>
+        <w:br/>
+        <w:t>Soham Thummar (23SOECE11081)</w:t>
+        <w:br/>
+        <w:t>Tannu Waghmare (23SOECE11084)</w:t>
+        <w:br/>
+        <w:br/>
+      </w:r>
       <w:r>
         <w:rPr>
           <w:rFonts w:ascii="Times New Roman" w:hAnsi="Times New Roman"/>
@@ -84,7 +115,22 @@
           <w:color w:val="000000"/>
           <w:sz w:val="24"/>
         </w:rPr>
-        <w:t>Submitted By:</w:t>
+        <w:t>UNDER THE GUIDANCE OF</w:t>
+        <w:br/>
+        <w:br/>
+      </w:r>
+      <w:r>
+        <w:rPr>
+          <w:rFonts w:ascii="Times New Roman" w:hAnsi="Times New Roman"/>
+          <w:b w:val="0"/>
+          <w:i w:val="0"/>
+          <w:color w:val="000000"/>
+          <w:sz w:val="24"/>
+        </w:rPr>
+        <w:t>Internal Guide: Prof. Neha Chauhan</w:t>
+        <w:br/>
+        <w:t>School of Engineering, RK University, Rajkot</w:t>
+        <w:br/>
         <w:br/>
       </w:r>
       <w:r>
@@ -95,48 +141,10 @@
           <w:color w:val="000000"/>
           <w:sz w:val="24"/>
         </w:rPr>
-        <w:t>Soham Thummar [Enrollment No: [FILL_ENROLLMENT_NO]]</w:t>
+        <w:t>August 2026</w:t>
         <w:br/>
         <w:br/>
-      </w:r>
-      <w:r>
-        <w:rPr>
-          <w:rFonts w:ascii="Times New Roman" w:hAnsi="Times New Roman"/>
-          <w:b/>
-          <w:i w:val="0"/>
-          <w:color w:val="000000"/>
-          <w:sz w:val="24"/>
-        </w:rPr>
-        <w:t>Under the Guidance of:</w:t>
-        <w:br/>
-      </w:r>
-      <w:r>
-        <w:rPr>
-          <w:rFonts w:ascii="Times New Roman" w:hAnsi="Times New Roman"/>
-          <w:b w:val="0"/>
-          <w:i w:val="0"/>
-          <w:color w:val="000000"/>
-          <w:sz w:val="24"/>
-        </w:rPr>
-        <w:t>Prof. [FILL GUIDE NAME]</w:t>
-        <w:br/>
-        <w:t>Department of Computer Engineering / IT</w:t>
-        <w:br/>
-        <w:br/>
-      </w:r>
-      <w:r>
-        <w:rPr>
-          <w:rFonts w:ascii="Times New Roman" w:hAnsi="Times New Roman"/>
-          <w:b/>
-          <w:i w:val="0"/>
-          <w:color w:val="000000"/>
-          <w:sz w:val="24"/>
-        </w:rPr>
-        <w:t>[FILL COLLEGE / INSTITUTE NAME]</w:t>
-        <w:br/>
-        <w:t>[FILL UNIVERSITY NAME]</w:t>
-        <w:br/>
-        <w:t>Academic Year: 2025–2026</w:t>
+        <w:t>SCHOOL OF ENGINEERING, RK UNIVERSITY, RAJKOT</w:t>
         <w:br/>
       </w:r>
     </w:p>
@@ -147,7 +155,7 @@
     </w:p>
     <w:p>
       <w:pPr>
-        <w:spacing w:before="960"/>
+        <w:spacing w:before="720"/>
         <w:jc w:val="center"/>
       </w:pPr>
       <w:r>
@@ -158,7 +166,7 @@
           <w:color w:val="000000"/>
           <w:sz w:val="32"/>
         </w:rPr>
-        <w:t>BRAIN TUMOR DETECTION MODEL USING KERAS &amp; FLASK DEPLOYMENT</w:t>
+        <w:t>BRAIN TUMOR DETECTION MODEL</w:t>
         <w:br/>
         <w:br/>
       </w:r>
@@ -170,7 +178,7 @@
           <w:color w:val="000000"/>
           <w:sz w:val="28"/>
         </w:rPr>
-        <w:t>7th Semester B.Tech Project Report</w:t>
+        <w:t>B.Tech Project Report</w:t>
         <w:br/>
       </w:r>
     </w:p>
@@ -203,7 +211,7 @@
           <w:color w:val="000000"/>
           <w:sz w:val="24"/>
         </w:rPr>
-        <w:t>Author / Candidate Name: Soham Thummar</w:t>
+        <w:t>Submitted By: Soham Thummar (23SOECE11081), Tannu Waghmare (23SOECE11084)</w:t>
       </w:r>
     </w:p>
     <w:p>
@@ -219,7 +227,7 @@
           <w:color w:val="000000"/>
           <w:sz w:val="24"/>
         </w:rPr>
-        <w:t>Enrollment Number: [FILL_ENROLLMENT_NO]</w:t>
+        <w:t>Branch / Department: Computer Engineering</w:t>
       </w:r>
     </w:p>
     <w:p>
@@ -235,7 +243,7 @@
           <w:color w:val="000000"/>
           <w:sz w:val="24"/>
         </w:rPr>
-        <w:t>Branch / Department: Department of Computer Engineering / IT</w:t>
+        <w:t>Internal Guide: Prof. Neha Chauhan</w:t>
       </w:r>
     </w:p>
     <w:p>
@@ -251,7 +259,7 @@
           <w:color w:val="000000"/>
           <w:sz w:val="24"/>
         </w:rPr>
-        <w:t>Internal Guide: Prof. [FILL GUIDE NAME]</w:t>
+        <w:t>Head of Department: Dr. Chetan Shingadiya</w:t>
       </w:r>
     </w:p>
     <w:p>
@@ -267,7 +275,7 @@
           <w:color w:val="000000"/>
           <w:sz w:val="24"/>
         </w:rPr>
-        <w:t>Institution: [FILL COLLEGE / INSTITUTE NAME]</w:t>
+        <w:t>Institution: School of Engineering, RK University, Rajkot</w:t>
       </w:r>
     </w:p>
     <w:p>
@@ -283,7 +291,7 @@
           <w:color w:val="000000"/>
           <w:sz w:val="24"/>
         </w:rPr>
-        <w:t>Date of Submission: [FILL SUBMISSION DATE, e.g. May 2026]</w:t>
+        <w:t>Date of Submission: August 2026</w:t>
       </w:r>
     </w:p>
     <w:p>
@@ -305,7 +313,7 @@
           <w:color w:val="000000"/>
           <w:sz w:val="32"/>
         </w:rPr>
-        <w:t>CANDIDATE'S DECLARATION</w:t>
+        <w:t>DECLARATION</w:t>
       </w:r>
     </w:p>
     <w:p>
@@ -321,23 +329,7 @@
           <w:color w:val="000000"/>
           <w:sz w:val="24"/>
         </w:rPr>
-        <w:t>I hereby declare that the project work entitled "BRAIN TUMOR DETECTION MODEL USING KERAS &amp; FLASK DEPLOYMENT" submitted to the Department of Computer Engineering / IT, [FILL COLLEGE / INSTITUTE NAME], is a record of original work done by me under the guidance of Prof. [FILL GUIDE NAME]. This report has not been submitted elsewhere for the award of any degree, diploma, or title.</w:t>
-      </w:r>
-    </w:p>
-    <w:p>
-      <w:pPr>
-        <w:spacing w:line="360" w:lineRule="auto" w:after="120"/>
-        <w:jc w:val="both"/>
-      </w:pPr>
-      <w:r>
-        <w:rPr>
-          <w:rFonts w:ascii="Times New Roman" w:hAnsi="Times New Roman"/>
-          <w:b w:val="0"/>
-          <w:i w:val="0"/>
-          <w:color w:val="000000"/>
-          <w:sz w:val="24"/>
-        </w:rPr>
-        <w:t>I further declare that all source codes, deep learning architectures, web application modules, automated PDF patient report microservices, and experimental results presented in this report are authentic and developed specifically for this project.</w:t>
+        <w:t>We hereby certify that We are the sole authors of this project work and that neither any part of this project work nor the whole of the project work has been submitted for a degree to any other University or Institution. We certify that, to the best of our knowledge, our project work does not infringe upon anyone’s copyright nor violate any proprietary rights and that any ideas, techniques, quotations, or any other material from the work of other people included in my/our project document, published or otherwise, are fully acknowledged in accordance with the standard referencing practices. We declare that this is a true copy of our project work, including any final revisions, as approved by my/our project review committee.</w:t>
       </w:r>
     </w:p>
     <w:p>
@@ -350,19 +342,25 @@
           <w:b/>
           <w:i w:val="0"/>
           <w:color w:val="000000"/>
-          <w:sz w:val="24"/>
+          <w:sz w:val="22"/>
         </w:rPr>
-        <w:t>Date: [FILL DATE]</w:t>
-        <w:br/>
-        <w:t>Place: [FILL CITY]</w:t>
+        <w:t>Signature of Student (S)</w:t>
         <w:br/>
         <w:br/>
+        <w:t>Soham Thummar (23SOECE11081)</w:t>
+        <w:tab/>
+        <w:tab/>
+        <w:t>Tannu Waghmare (23SOECE11084)</w:t>
         <w:br/>
-        <w:t>_______________________</w:t>
+        <w:t>Date: August 2026</w:t>
+        <w:tab/>
+        <w:tab/>
+        <w:t>Date: August 2026</w:t>
         <w:br/>
-        <w:t>Soham Thummar</w:t>
-        <w:br/>
-        <w:t>(Enrollment No: [FILL_ENROLLMENT_NO])</w:t>
+        <w:t>Place: Rajkot, Gujarat</w:t>
+        <w:tab/>
+        <w:tab/>
+        <w:t>Place: Rajkot, Gujarat</w:t>
       </w:r>
     </w:p>
     <w:p>
@@ -400,12 +398,28 @@
           <w:color w:val="000000"/>
           <w:sz w:val="24"/>
         </w:rPr>
-        <w:t>This is to certify that the project report entitled "BRAIN TUMOR DETECTION MODEL USING KERAS &amp; FLASK DEPLOYMENT" submitted by Soham Thummar (Enrollment No: [FILL_ENROLLMENT_NO]) has been successfully completed under my supervision in partial fulfillment of the requirements for the degree of Bachelor of Technology in Department of Computer Engineering / IT from [FILL UNIVERSITY NAME] during the academic year 2025–2026.</w:t>
+        <w:t>This is to certify that the work which is being presented in the Project Report entitled "BRAIN TUMOR DETECTION MODEL", in partial fulfillment of the requirement for the award of the degree of B.Tech. (Computer Engineering) and submitted to the School of Engineering, RK University, Rajkot, is an authentic record of our own work carried out during a period from June 2026 to December 2026.</w:t>
       </w:r>
     </w:p>
     <w:p>
       <w:pPr>
-        <w:spacing w:before="1280"/>
+        <w:spacing w:line="360" w:lineRule="auto" w:after="120"/>
+        <w:jc w:val="both"/>
+      </w:pPr>
+      <w:r>
+        <w:rPr>
+          <w:rFonts w:ascii="Times New Roman" w:hAnsi="Times New Roman"/>
+          <w:b w:val="0"/>
+          <w:i w:val="0"/>
+          <w:color w:val="000000"/>
+          <w:sz w:val="24"/>
+        </w:rPr>
+        <w:t>The matter presented in this Project Report has not been submitted by us for the award of any other degree elsewhere.</w:t>
+      </w:r>
+    </w:p>
+    <w:p>
+      <w:pPr>
+        <w:spacing w:before="960"/>
       </w:pPr>
       <w:r>
         <w:rPr>
@@ -413,31 +427,49 @@
           <w:b/>
           <w:i w:val="0"/>
           <w:color w:val="000000"/>
-          <w:sz w:val="24"/>
+          <w:sz w:val="22"/>
         </w:rPr>
-        <w:t>_______________________</w:t>
+        <w:t>Signature of Student (S)</w:t>
+        <w:br/>
+        <w:br/>
+        <w:t>Soham Thummar (23SOECE11081), Tannu Waghmare (23SOECE11084)</w:t>
+        <w:br/>
+        <w:br/>
+        <w:br/>
+        <w:t>This is to certify that the above statement made by the students is correct to the best of my knowledge.</w:t>
+        <w:br/>
+        <w:br/>
+        <w:br/>
+        <w:t>Internal Guide:</w:t>
         <w:tab/>
         <w:tab/>
         <w:tab/>
-        <w:t>_______________________</w:t>
+        <w:tab/>
+        <w:t>Head of Department:</w:t>
         <w:br/>
-        <w:t>Prof. [FILL GUIDE NAME]</w:t>
+        <w:t>Prof. Neha Chauhan</w:t>
         <w:tab/>
         <w:tab/>
         <w:tab/>
-        <w:t>Head of Department</w:t>
+        <w:tab/>
+        <w:t>Dr. Chetan Shingadiya</w:t>
         <w:br/>
-        <w:t>(Project Guide)</w:t>
+        <w:t>Assistant Professor, CE / IT</w:t>
         <w:tab/>
         <w:tab/>
         <w:tab/>
-        <w:t>(Department of Computer Engineering / IT)</w:t>
+        <w:tab/>
+        <w:t>CE / IT, School of Engineering, RK University, Rajkot</w:t>
+        <w:br/>
+        <w:t>RK University, Rajkot</w:t>
+        <w:tab/>
+        <w:tab/>
+        <w:tab/>
+        <w:tab/>
+        <w:t>RK University, Rajkot</w:t>
         <w:br/>
         <w:br/>
-        <w:br/>
-        <w:t>_______________________</w:t>
-        <w:br/>
-        <w:t>External Examiner</w:t>
+        <w:t>August 2026</w:t>
       </w:r>
     </w:p>
     <w:p>
@@ -475,7 +507,7 @@
           <w:color w:val="000000"/>
           <w:sz w:val="24"/>
         </w:rPr>
-        <w:t>I express my deepest sense of gratitude and sincere thanks to my project guide, Prof. [FILL GUIDE NAME], for invaluable guidance, encouragement, and insightful suggestions throughout the development of this project. His/Her technical expertise and continuous mentorship were instrumental in shaping the methodology and successful execution of the model, explainability heatmaps, and web application.</w:t>
+        <w:t>We express our sincere gratitude and appreciation to our project guide, Prof. Neha Chauhan, for providing valuable guidance, continuous support, and constructive suggestions throughout the development of this project. Her technical expertise and encouragement greatly contributed to the successful implementation of the Brain Tumor Detection System, including the CNN model, model evaluation, Grad-CAM visualization, and web application.</w:t>
       </w:r>
     </w:p>
     <w:p>
@@ -491,7 +523,7 @@
           <w:color w:val="000000"/>
           <w:sz w:val="24"/>
         </w:rPr>
-        <w:t>I am also thankful to the Head of Department, Prof. [FILL HOD NAME], and all faculty members of the Department of Computer Engineering / IT for providing the required computational infrastructure, software tools, and academic environment.</w:t>
+        <w:t>We would also like to express our sincere thanks to the Head of Department, Dr. Chetan Shingadiya, for providing the necessary academic guidance, computational resources, and facilities required for carrying out the project.</w:t>
       </w:r>
     </w:p>
     <w:p>
@@ -507,7 +539,23 @@
           <w:color w:val="000000"/>
           <w:sz w:val="24"/>
         </w:rPr>
-        <w:t>Finally, I express my sincere appreciation to my family and friends for their constant moral support, patience, and encouragement during the course of this major project.</w:t>
+        <w:t>We are grateful to all faculty members of the Department of Computer Engineering / IT for their valuable suggestions, technical guidance, and support throughout the project work.</w:t>
+      </w:r>
+    </w:p>
+    <w:p>
+      <w:pPr>
+        <w:spacing w:line="360" w:lineRule="auto" w:after="120"/>
+        <w:jc w:val="both"/>
+      </w:pPr>
+      <w:r>
+        <w:rPr>
+          <w:rFonts w:ascii="Times New Roman" w:hAnsi="Times New Roman"/>
+          <w:b w:val="0"/>
+          <w:i w:val="0"/>
+          <w:color w:val="000000"/>
+          <w:sz w:val="24"/>
+        </w:rPr>
+        <w:t>Finally, We extend our sincere appreciation to everyone in the department who provided their valuable assistance and cooperation during the course of this project.</w:t>
       </w:r>
     </w:p>
     <w:p>
@@ -5264,7 +5312,7 @@
         </w:rPr>
         <w:t>Primary Use Case Scenario:</w:t>
         <w:br/>
-        <w:t>1. User accesses web homepage at http://127.0.0.1:5000 via one-click start.py script.</w:t>
+        <w:t>1. User accesses the NeuroScan AI Web Application Portal via the web interface launcher.</w:t>
         <w:br/>
         <w:t>2. User selects or drops a brain MRI image file (PNG/JPG).</w:t>
         <w:br/>
@@ -5355,6 +5403,81 @@
           <w:color w:val="000000"/>
           <w:sz w:val="24"/>
         </w:rPr>
+        <w:t>4.7.2 E-R Diagrams</w:t>
+      </w:r>
+    </w:p>
+    <w:p>
+      <w:pPr>
+        <w:spacing w:line="360" w:lineRule="auto" w:after="120"/>
+        <w:jc w:val="both"/>
+      </w:pPr>
+      <w:r>
+        <w:rPr>
+          <w:rFonts w:ascii="Times New Roman" w:hAnsi="Times New Roman"/>
+          <w:b w:val="0"/>
+          <w:i w:val="0"/>
+          <w:color w:val="000000"/>
+          <w:sz w:val="24"/>
+        </w:rPr>
+        <w:t>Entity-Relationship (E-R) Structure:</w:t>
+        <w:br/>
+        <w:t>The system models data relationships between system actors, submitted MRI image scans, deep learning predictions, explainability visual artifacts, and generated patient diagnostic reports:</w:t>
+        <w:br/>
+        <w:t>• Entities: USER (User_ID, Name, Role), MRI_SCAN (Scan_ID, Filename, Upload_Timestamp), MODEL_PREDICTION (Prediction_ID, Label, Confidence_%, Probability), VISUAL_EXPLAINABILITY (Artifact_ID, Heatmap_Path, HUD_Highlight_Path), and PATIENT_PDF_REPORT (Report_ID, PDF_Filename).</w:t>
+        <w:br/>
+        <w:t>• Relationships: USER (1:N) Uploads MRI_SCAN; MRI_SCAN (1:1) Processes MODEL_PREDICTION; MODEL_PREDICTION (1:1) Generates VISUAL_EXPLAINABILITY artifacts; and MODEL_PREDICTION (1:1) Produces PATIENT_PDF_REPORT.</w:t>
+      </w:r>
+    </w:p>
+    <w:p>
+      <w:r>
+        <w:drawing>
+          <wp:inline xmlns:a="http://schemas.openxmlformats.org/drawingml/2006/main" xmlns:pic="http://schemas.openxmlformats.org/drawingml/2006/picture">
+            <wp:extent cx="5486400" cy="3373764"/>
+            <wp:docPr id="1" name="Picture 1"/>
+            <wp:cNvGraphicFramePr>
+              <a:graphicFrameLocks noChangeAspect="1"/>
+            </wp:cNvGraphicFramePr>
+            <a:graphic>
+              <a:graphicData uri="http://schemas.openxmlformats.org/drawingml/2006/picture">
+                <pic:pic>
+                  <pic:nvPicPr>
+                    <pic:cNvPr id="0" name="er_diagram.png"/>
+                    <pic:cNvPicPr/>
+                  </pic:nvPicPr>
+                  <pic:blipFill>
+                    <a:blip r:embed="rId13"/>
+                    <a:stretch>
+                      <a:fillRect/>
+                    </a:stretch>
+                  </pic:blipFill>
+                  <pic:spPr>
+                    <a:xfrm>
+                      <a:off x="0" y="0"/>
+                      <a:ext cx="5486400" cy="3373764"/>
+                    </a:xfrm>
+                    <a:prstGeom prst="rect"/>
+                  </pic:spPr>
+                </pic:pic>
+              </a:graphicData>
+            </a:graphic>
+          </wp:inline>
+        </w:drawing>
+      </w:r>
+    </w:p>
+    <w:p>
+      <w:pPr>
+        <w:keepNext/>
+        <w:spacing w:before="240" w:after="120"/>
+        <w:jc w:val="left"/>
+      </w:pPr>
+      <w:r>
+        <w:rPr>
+          <w:rFonts w:ascii="Times New Roman" w:hAnsi="Times New Roman"/>
+          <w:b/>
+          <w:i w:val="0"/>
+          <w:color w:val="000000"/>
+          <w:sz w:val="24"/>
+        </w:rPr>
         <w:t>4.7.3 Class Diagram</w:t>
       </w:r>
     </w:p>
@@ -5387,6 +5510,42 @@
       </w:r>
     </w:p>
     <w:p>
+      <w:r>
+        <w:drawing>
+          <wp:inline xmlns:a="http://schemas.openxmlformats.org/drawingml/2006/main" xmlns:pic="http://schemas.openxmlformats.org/drawingml/2006/picture">
+            <wp:extent cx="5486400" cy="2713648"/>
+            <wp:docPr id="2" name="Picture 2"/>
+            <wp:cNvGraphicFramePr>
+              <a:graphicFrameLocks noChangeAspect="1"/>
+            </wp:cNvGraphicFramePr>
+            <a:graphic>
+              <a:graphicData uri="http://schemas.openxmlformats.org/drawingml/2006/picture">
+                <pic:pic>
+                  <pic:nvPicPr>
+                    <pic:cNvPr id="0" name="class_architecture.png"/>
+                    <pic:cNvPicPr/>
+                  </pic:nvPicPr>
+                  <pic:blipFill>
+                    <a:blip r:embed="rId14"/>
+                    <a:stretch>
+                      <a:fillRect/>
+                    </a:stretch>
+                  </pic:blipFill>
+                  <pic:spPr>
+                    <a:xfrm>
+                      <a:off x="0" y="0"/>
+                      <a:ext cx="5486400" cy="2713648"/>
+                    </a:xfrm>
+                    <a:prstGeom prst="rect"/>
+                  </pic:spPr>
+                </pic:pic>
+              </a:graphicData>
+            </a:graphic>
+          </wp:inline>
+        </w:drawing>
+      </w:r>
+    </w:p>
+    <w:p>
       <w:pPr>
         <w:keepNext/>
         <w:spacing w:before="240" w:after="120"/>
@@ -5472,6 +5631,78 @@
       </w:r>
     </w:p>
     <w:p>
+      <w:r>
+        <w:drawing>
+          <wp:inline xmlns:a="http://schemas.openxmlformats.org/drawingml/2006/main" xmlns:pic="http://schemas.openxmlformats.org/drawingml/2006/picture">
+            <wp:extent cx="5303520" cy="1100182"/>
+            <wp:docPr id="3" name="Picture 3"/>
+            <wp:cNvGraphicFramePr>
+              <a:graphicFrameLocks noChangeAspect="1"/>
+            </wp:cNvGraphicFramePr>
+            <a:graphic>
+              <a:graphicData uri="http://schemas.openxmlformats.org/drawingml/2006/picture">
+                <pic:pic>
+                  <pic:nvPicPr>
+                    <pic:cNvPr id="0" name="dfd_level0.png"/>
+                    <pic:cNvPicPr/>
+                  </pic:nvPicPr>
+                  <pic:blipFill>
+                    <a:blip r:embed="rId15"/>
+                    <a:stretch>
+                      <a:fillRect/>
+                    </a:stretch>
+                  </pic:blipFill>
+                  <pic:spPr>
+                    <a:xfrm>
+                      <a:off x="0" y="0"/>
+                      <a:ext cx="5303520" cy="1100182"/>
+                    </a:xfrm>
+                    <a:prstGeom prst="rect"/>
+                  </pic:spPr>
+                </pic:pic>
+              </a:graphicData>
+            </a:graphic>
+          </wp:inline>
+        </w:drawing>
+      </w:r>
+    </w:p>
+    <w:p>
+      <w:r>
+        <w:drawing>
+          <wp:inline xmlns:a="http://schemas.openxmlformats.org/drawingml/2006/main" xmlns:pic="http://schemas.openxmlformats.org/drawingml/2006/picture">
+            <wp:extent cx="5486400" cy="1557250"/>
+            <wp:docPr id="4" name="Picture 4"/>
+            <wp:cNvGraphicFramePr>
+              <a:graphicFrameLocks noChangeAspect="1"/>
+            </wp:cNvGraphicFramePr>
+            <a:graphic>
+              <a:graphicData uri="http://schemas.openxmlformats.org/drawingml/2006/picture">
+                <pic:pic>
+                  <pic:nvPicPr>
+                    <pic:cNvPr id="0" name="dfd_level1.png"/>
+                    <pic:cNvPicPr/>
+                  </pic:nvPicPr>
+                  <pic:blipFill>
+                    <a:blip r:embed="rId16"/>
+                    <a:stretch>
+                      <a:fillRect/>
+                    </a:stretch>
+                  </pic:blipFill>
+                  <pic:spPr>
+                    <a:xfrm>
+                      <a:off x="0" y="0"/>
+                      <a:ext cx="5486400" cy="1557250"/>
+                    </a:xfrm>
+                    <a:prstGeom prst="rect"/>
+                  </pic:spPr>
+                </pic:pic>
+              </a:graphicData>
+            </a:graphic>
+          </wp:inline>
+        </w:drawing>
+      </w:r>
+    </w:p>
+    <w:p>
       <w:pPr>
         <w:keepNext/>
         <w:spacing w:before="240" w:after="120"/>
@@ -5485,7 +5716,7 @@
           <w:color w:val="000000"/>
           <w:sz w:val="24"/>
         </w:rPr>
-        <w:t>4.8.2 Process Specification And Decision Logic</w:t>
+        <w:t>4.8.3 Control Flow Diagram</w:t>
       </w:r>
     </w:p>
     <w:p>
@@ -5501,11 +5732,55 @@
           <w:color w:val="000000"/>
           <w:sz w:val="24"/>
         </w:rPr>
-        <w:t>Decision Logic for Classification:</w:t>
+        <w:t>Control Flow Structure:</w:t>
         <w:br/>
-        <w:t>IF prediction_probability &gt;= 0.3 THEN label = 'Tumor', confidence = probability * 100</w:t>
+        <w:t>The Control Flow Diagram (CFD) defines the operational state transitions, decision predicates, error exception branches, and threshold evaluators executed during model loading, upload validation, CNN classification, Grad-CAM autograd overlay generation, and PDF streaming:</w:t>
         <w:br/>
-        <w:t>ELSE label = 'No Tumor', confidence = (1 - probability) * 100</w:t>
+        <w:t>• Boot Stage: load_model() checks model artifact existence -&gt; raises FileNotFoundError on missing weights; else pre-loads weights into memory.</w:t>
+        <w:br/>
+        <w:t>• Guard Stage: POST /predict -&gt; checks file presence, .png/.jpg extensions, and 10MB size limit; aborts HTTP 400 on error.</w:t>
+        <w:br/>
+        <w:t>• Classification Stage: Feedforward pass -&gt; evaluates p &gt;= 0.3 threshold ('Tumor' vs 'No Tumor').</w:t>
+        <w:br/>
+        <w:t>• Visual Overlay Stage: tf.GradientTape autograd -&gt; computes JET heatmap overlay and top 50% ROI bounding box contour highlight.</w:t>
+        <w:br/>
+        <w:t>• Report &amp; Download Stage: ReportLab synthesizes printable PDF diagnostic report -&gt; renders result view with download attachment button.</w:t>
+      </w:r>
+    </w:p>
+    <w:p>
+      <w:r>
+        <w:drawing>
+          <wp:inline xmlns:a="http://schemas.openxmlformats.org/drawingml/2006/main" xmlns:pic="http://schemas.openxmlformats.org/drawingml/2006/picture">
+            <wp:extent cx="5486400" cy="3454756"/>
+            <wp:docPr id="5" name="Picture 5"/>
+            <wp:cNvGraphicFramePr>
+              <a:graphicFrameLocks noChangeAspect="1"/>
+            </wp:cNvGraphicFramePr>
+            <a:graphic>
+              <a:graphicData uri="http://schemas.openxmlformats.org/drawingml/2006/picture">
+                <pic:pic>
+                  <pic:nvPicPr>
+                    <pic:cNvPr id="0" name="control_flow_diagram.png"/>
+                    <pic:cNvPicPr/>
+                  </pic:nvPicPr>
+                  <pic:blipFill>
+                    <a:blip r:embed="rId17"/>
+                    <a:stretch>
+                      <a:fillRect/>
+                    </a:stretch>
+                  </pic:blipFill>
+                  <pic:spPr>
+                    <a:xfrm>
+                      <a:off x="0" y="0"/>
+                      <a:ext cx="5486400" cy="3454756"/>
+                    </a:xfrm>
+                    <a:prstGeom prst="rect"/>
+                  </pic:spPr>
+                </pic:pic>
+              </a:graphicData>
+            </a:graphic>
+          </wp:inline>
+        </w:drawing>
       </w:r>
     </w:p>
     <w:p>
@@ -7475,7 +7750,7 @@
         <w:drawing>
           <wp:inline xmlns:a="http://schemas.openxmlformats.org/drawingml/2006/main" xmlns:pic="http://schemas.openxmlformats.org/drawingml/2006/picture">
             <wp:extent cx="4114800" cy="2763325"/>
-            <wp:docPr id="1" name="Picture 1"/>
+            <wp:docPr id="6" name="Picture 6"/>
             <wp:cNvGraphicFramePr>
               <a:graphicFrameLocks noChangeAspect="1"/>
             </wp:cNvGraphicFramePr>
@@ -7487,7 +7762,7 @@
                     <pic:cNvPicPr/>
                   </pic:nvPicPr>
                   <pic:blipFill>
-                    <a:blip r:embed="rId13"/>
+                    <a:blip r:embed="rId18"/>
                     <a:stretch>
                       <a:fillRect/>
                     </a:stretch>
@@ -7531,7 +7806,7 @@
         <w:drawing>
           <wp:inline xmlns:a="http://schemas.openxmlformats.org/drawingml/2006/main" xmlns:pic="http://schemas.openxmlformats.org/drawingml/2006/picture">
             <wp:extent cx="4114800" cy="2763325"/>
-            <wp:docPr id="2" name="Picture 2"/>
+            <wp:docPr id="7" name="Picture 7"/>
             <wp:cNvGraphicFramePr>
               <a:graphicFrameLocks noChangeAspect="1"/>
             </wp:cNvGraphicFramePr>
@@ -7543,7 +7818,7 @@
                     <pic:cNvPicPr/>
                   </pic:nvPicPr>
                   <pic:blipFill>
-                    <a:blip r:embed="rId14"/>
+                    <a:blip r:embed="rId19"/>
                     <a:stretch>
                       <a:fillRect/>
                     </a:stretch>
@@ -7587,7 +7862,7 @@
         <w:drawing>
           <wp:inline xmlns:a="http://schemas.openxmlformats.org/drawingml/2006/main" xmlns:pic="http://schemas.openxmlformats.org/drawingml/2006/picture">
             <wp:extent cx="4114800" cy="3786153"/>
-            <wp:docPr id="3" name="Picture 3"/>
+            <wp:docPr id="8" name="Picture 8"/>
             <wp:cNvGraphicFramePr>
               <a:graphicFrameLocks noChangeAspect="1"/>
             </wp:cNvGraphicFramePr>
@@ -7599,7 +7874,7 @@
                     <pic:cNvPicPr/>
                   </pic:nvPicPr>
                   <pic:blipFill>
-                    <a:blip r:embed="rId15"/>
+                    <a:blip r:embed="rId20"/>
                     <a:stretch>
                       <a:fillRect/>
                     </a:stretch>
@@ -7643,7 +7918,7 @@
         <w:drawing>
           <wp:inline xmlns:a="http://schemas.openxmlformats.org/drawingml/2006/main" xmlns:pic="http://schemas.openxmlformats.org/drawingml/2006/picture">
             <wp:extent cx="4114800" cy="3643575"/>
-            <wp:docPr id="4" name="Picture 4"/>
+            <wp:docPr id="9" name="Picture 9"/>
             <wp:cNvGraphicFramePr>
               <a:graphicFrameLocks noChangeAspect="1"/>
             </wp:cNvGraphicFramePr>
@@ -7655,7 +7930,7 @@
                     <pic:cNvPicPr/>
                   </pic:nvPicPr>
                   <pic:blipFill>
-                    <a:blip r:embed="rId16"/>
+                    <a:blip r:embed="rId21"/>
                     <a:stretch>
                       <a:fillRect/>
                     </a:stretch>
@@ -7758,7 +8033,7 @@
           <w:color w:val="000000"/>
           <w:sz w:val="24"/>
         </w:rPr>
-        <w:t>2. Open web browser and navigate to http://127.0.0.1:5000.</w:t>
+        <w:t>2. Open web browser and navigate to the NeuroScan AI Web Application Portal.</w:t>
       </w:r>
     </w:p>
     <w:p>
@@ -8399,7 +8674,7 @@
         <w:color w:val="646464"/>
         <w:sz w:val="20"/>
       </w:rPr>
-      <w:t>[Enrollment No: FILL_ENROLLMENT_NO]</w:t>
+      <w:t>23SOECE11081, 23SOECE11084</w:t>
       <w:tab/>
       <w:tab/>
     </w:r>
@@ -8433,7 +8708,7 @@
         <w:color w:val="646464"/>
         <w:sz w:val="20"/>
       </w:rPr>
-      <w:t>[Enrollment No: FILL_ENROLLMENT_NO]</w:t>
+      <w:t>23SOECE11081, 23SOECE11084</w:t>
       <w:tab/>
       <w:tab/>
     </w:r>

</xml_diff>